<commit_message>
Task 4: Docker files - Dockerfiles and docker-compose.yml
</commit_message>
<xml_diff>
--- a/Task3_Authentication.docx
+++ b/Task3_Authentication.docx
@@ -146,50 +146,30 @@
           <w:szCs w:val="28"/>
         </w:rPr>
       </w:pPr>
-      <w:proofErr w:type="spellStart"/>
-      <w:r>
-        <w:rPr>
-          <w:rFonts w:ascii="Times New Roman" w:hAnsi="Times New Roman" w:cs="Times New Roman"/>
-          <w:sz w:val="28"/>
-          <w:szCs w:val="28"/>
-        </w:rPr>
-        <w:t>bcryptjs</w:t>
-      </w:r>
-      <w:proofErr w:type="spellEnd"/>
-      <w:r>
-        <w:rPr>
-          <w:rFonts w:ascii="Times New Roman" w:hAnsi="Times New Roman" w:cs="Times New Roman"/>
-          <w:sz w:val="28"/>
-          <w:szCs w:val="28"/>
-        </w:rPr>
-        <w:t xml:space="preserve">       → Password hashing</w:t>
-      </w:r>
-    </w:p>
-    <w:p>
-      <w:pPr>
-        <w:rPr>
-          <w:rFonts w:ascii="Times New Roman" w:hAnsi="Times New Roman" w:cs="Times New Roman"/>
-          <w:sz w:val="28"/>
-          <w:szCs w:val="28"/>
-        </w:rPr>
-      </w:pPr>
-      <w:proofErr w:type="spellStart"/>
-      <w:r>
-        <w:rPr>
-          <w:rFonts w:ascii="Times New Roman" w:hAnsi="Times New Roman" w:cs="Times New Roman"/>
-          <w:sz w:val="28"/>
-          <w:szCs w:val="28"/>
-        </w:rPr>
-        <w:t>jsonwebtoken</w:t>
-      </w:r>
-      <w:proofErr w:type="spellEnd"/>
-      <w:r>
-        <w:rPr>
-          <w:rFonts w:ascii="Times New Roman" w:hAnsi="Times New Roman" w:cs="Times New Roman"/>
-          <w:sz w:val="28"/>
-          <w:szCs w:val="28"/>
-        </w:rPr>
-        <w:t xml:space="preserve">   → JWT token generation &amp; verification</w:t>
+      <w:r>
+        <w:rPr>
+          <w:rFonts w:ascii="Times New Roman" w:hAnsi="Times New Roman" w:cs="Times New Roman"/>
+          <w:sz w:val="28"/>
+          <w:szCs w:val="28"/>
+        </w:rPr>
+        <w:t>bcryptjs       → Password hashing</w:t>
+      </w:r>
+    </w:p>
+    <w:p>
+      <w:pPr>
+        <w:rPr>
+          <w:rFonts w:ascii="Times New Roman" w:hAnsi="Times New Roman" w:cs="Times New Roman"/>
+          <w:sz w:val="28"/>
+          <w:szCs w:val="28"/>
+        </w:rPr>
+      </w:pPr>
+      <w:r>
+        <w:rPr>
+          <w:rFonts w:ascii="Times New Roman" w:hAnsi="Times New Roman" w:cs="Times New Roman"/>
+          <w:sz w:val="28"/>
+          <w:szCs w:val="28"/>
+        </w:rPr>
+        <w:t>jsonwebtoken   → JWT token generation &amp; verification</w:t>
       </w:r>
     </w:p>
     <w:p>
@@ -470,29 +450,7 @@
           <w:sz w:val="28"/>
           <w:szCs w:val="28"/>
         </w:rPr>
-        <w:t>1. Password Hashing (</w:t>
-      </w:r>
-      <w:proofErr w:type="spellStart"/>
-      <w:r>
-        <w:rPr>
-          <w:rFonts w:ascii="Times New Roman" w:hAnsi="Times New Roman" w:cs="Times New Roman"/>
-          <w:b/>
-          <w:bCs/>
-          <w:sz w:val="28"/>
-          <w:szCs w:val="28"/>
-        </w:rPr>
-        <w:t>bcrypt</w:t>
-      </w:r>
-      <w:proofErr w:type="spellEnd"/>
-      <w:r>
-        <w:rPr>
-          <w:rFonts w:ascii="Times New Roman" w:hAnsi="Times New Roman" w:cs="Times New Roman"/>
-          <w:b/>
-          <w:bCs/>
-          <w:sz w:val="28"/>
-          <w:szCs w:val="28"/>
-        </w:rPr>
-        <w:t>)</w:t>
+        <w:t>1. Password Hashing (bcrypt)</w:t>
       </w:r>
     </w:p>
     <w:p>
@@ -553,25 +511,7 @@
           <w:sz w:val="28"/>
           <w:szCs w:val="28"/>
         </w:rPr>
-        <w:t xml:space="preserve">"mypassword123" → </w:t>
-      </w:r>
-      <w:proofErr w:type="spellStart"/>
-      <w:r>
-        <w:rPr>
-          <w:rFonts w:ascii="Times New Roman" w:hAnsi="Times New Roman" w:cs="Times New Roman"/>
-          <w:sz w:val="28"/>
-          <w:szCs w:val="28"/>
-        </w:rPr>
-        <w:t>bcrypt.hash</w:t>
-      </w:r>
-      <w:proofErr w:type="spellEnd"/>
-      <w:r>
-        <w:rPr>
-          <w:rFonts w:ascii="Times New Roman" w:hAnsi="Times New Roman" w:cs="Times New Roman"/>
-          <w:sz w:val="28"/>
-          <w:szCs w:val="28"/>
-        </w:rPr>
-        <w:t>() → "$2a$10$N9qo8uLOickgx2..."</w:t>
+        <w:t>"mypassword123" → bcrypt.hash() → "$2a$10$N9qo8uLOickgx2..."</w:t>
       </w:r>
     </w:p>
     <w:p>
@@ -1079,24 +1019,7 @@
           <w:szCs w:val="28"/>
         </w:rPr>
         <w:br/>
-      </w:r>
-      <w:proofErr w:type="spellStart"/>
-      <w:r>
-        <w:rPr>
-          <w:rFonts w:ascii="Times New Roman" w:hAnsi="Times New Roman" w:cs="Times New Roman"/>
-          <w:sz w:val="28"/>
-          <w:szCs w:val="28"/>
-        </w:rPr>
-        <w:t>bcrypt's</w:t>
-      </w:r>
-      <w:proofErr w:type="spellEnd"/>
-      <w:r>
-        <w:rPr>
-          <w:rFonts w:ascii="Times New Roman" w:hAnsi="Times New Roman" w:cs="Times New Roman"/>
-          <w:sz w:val="28"/>
-          <w:szCs w:val="28"/>
-        </w:rPr>
-        <w:t xml:space="preserve"> pre-save hook, ensuring passwords are never stored</w:t>
+        <w:t>bcrypt's pre-save hook, ensuring passwords are never stored</w:t>
       </w:r>
       <w:r>
         <w:rPr>
@@ -1135,52 +1058,14 @@
           <w:szCs w:val="28"/>
         </w:rPr>
       </w:pPr>
-      <w:proofErr w:type="spellStart"/>
-      <w:r>
-        <w:rPr>
-          <w:rFonts w:ascii="Times New Roman" w:hAnsi="Times New Roman" w:cs="Times New Roman"/>
-          <w:sz w:val="28"/>
-          <w:szCs w:val="28"/>
-        </w:rPr>
-        <w:t>npm</w:t>
-      </w:r>
-      <w:proofErr w:type="spellEnd"/>
-      <w:r>
-        <w:rPr>
-          <w:rFonts w:ascii="Times New Roman" w:hAnsi="Times New Roman" w:cs="Times New Roman"/>
-          <w:sz w:val="28"/>
-          <w:szCs w:val="28"/>
-        </w:rPr>
-        <w:t xml:space="preserve"> install </w:t>
-      </w:r>
-      <w:proofErr w:type="spellStart"/>
-      <w:r>
-        <w:rPr>
-          <w:rFonts w:ascii="Times New Roman" w:hAnsi="Times New Roman" w:cs="Times New Roman"/>
-          <w:sz w:val="28"/>
-          <w:szCs w:val="28"/>
-        </w:rPr>
-        <w:t>bcryptjs</w:t>
-      </w:r>
-      <w:proofErr w:type="spellEnd"/>
-      <w:r>
-        <w:rPr>
-          <w:rFonts w:ascii="Times New Roman" w:hAnsi="Times New Roman" w:cs="Times New Roman"/>
-          <w:sz w:val="28"/>
-          <w:szCs w:val="28"/>
-        </w:rPr>
-        <w:t xml:space="preserve"> </w:t>
-      </w:r>
-      <w:proofErr w:type="spellStart"/>
-      <w:r>
-        <w:rPr>
-          <w:rFonts w:ascii="Times New Roman" w:hAnsi="Times New Roman" w:cs="Times New Roman"/>
-          <w:sz w:val="28"/>
-          <w:szCs w:val="28"/>
-        </w:rPr>
-        <w:t>jsonwebtoken</w:t>
-      </w:r>
-      <w:proofErr w:type="spellEnd"/>
+      <w:r>
+        <w:rPr>
+          <w:rFonts w:ascii="Times New Roman" w:hAnsi="Times New Roman" w:cs="Times New Roman"/>
+          <w:sz w:val="28"/>
+          <w:szCs w:val="28"/>
+        </w:rPr>
+        <w:t>npm install bcryptjs jsonwebtoken</w:t>
+      </w:r>
     </w:p>
     <w:p>
       <w:pPr>
@@ -1213,23 +1098,13 @@
           <w:szCs w:val="28"/>
         </w:rPr>
       </w:pPr>
-      <w:proofErr w:type="spellStart"/>
-      <w:r>
-        <w:rPr>
-          <w:rFonts w:ascii="Times New Roman" w:hAnsi="Times New Roman" w:cs="Times New Roman"/>
-          <w:sz w:val="28"/>
-          <w:szCs w:val="28"/>
-        </w:rPr>
-        <w:t>bcrypt.genSalt</w:t>
-      </w:r>
-      <w:proofErr w:type="spellEnd"/>
-      <w:r>
-        <w:rPr>
-          <w:rFonts w:ascii="Times New Roman" w:hAnsi="Times New Roman" w:cs="Times New Roman"/>
-          <w:sz w:val="28"/>
-          <w:szCs w:val="28"/>
-        </w:rPr>
-        <w:t>() → generates random salt for hashing</w:t>
+      <w:r>
+        <w:rPr>
+          <w:rFonts w:ascii="Times New Roman" w:hAnsi="Times New Roman" w:cs="Times New Roman"/>
+          <w:sz w:val="28"/>
+          <w:szCs w:val="28"/>
+        </w:rPr>
+        <w:t>bcrypt.genSalt() → generates random salt for hashing</w:t>
       </w:r>
     </w:p>
     <w:p>
@@ -1244,23 +1119,13 @@
           <w:szCs w:val="28"/>
         </w:rPr>
       </w:pPr>
-      <w:proofErr w:type="spellStart"/>
-      <w:r>
-        <w:rPr>
-          <w:rFonts w:ascii="Times New Roman" w:hAnsi="Times New Roman" w:cs="Times New Roman"/>
-          <w:sz w:val="28"/>
-          <w:szCs w:val="28"/>
-        </w:rPr>
-        <w:t>bcrypt.hash</w:t>
-      </w:r>
-      <w:proofErr w:type="spellEnd"/>
-      <w:r>
-        <w:rPr>
-          <w:rFonts w:ascii="Times New Roman" w:hAnsi="Times New Roman" w:cs="Times New Roman"/>
-          <w:sz w:val="28"/>
-          <w:szCs w:val="28"/>
-        </w:rPr>
-        <w:t>() → converts plain password to secure hash</w:t>
+      <w:r>
+        <w:rPr>
+          <w:rFonts w:ascii="Times New Roman" w:hAnsi="Times New Roman" w:cs="Times New Roman"/>
+          <w:sz w:val="28"/>
+          <w:szCs w:val="28"/>
+        </w:rPr>
+        <w:t>bcrypt.hash() → converts plain password to secure hash</w:t>
       </w:r>
     </w:p>
     <w:p>
@@ -1296,23 +1161,13 @@
           <w:szCs w:val="28"/>
         </w:rPr>
       </w:pPr>
-      <w:proofErr w:type="spellStart"/>
-      <w:r>
-        <w:rPr>
-          <w:rFonts w:ascii="Times New Roman" w:hAnsi="Times New Roman" w:cs="Times New Roman"/>
-          <w:sz w:val="28"/>
-          <w:szCs w:val="28"/>
-        </w:rPr>
-        <w:t>matchPassword</w:t>
-      </w:r>
-      <w:proofErr w:type="spellEnd"/>
-      <w:r>
-        <w:rPr>
-          <w:rFonts w:ascii="Times New Roman" w:hAnsi="Times New Roman" w:cs="Times New Roman"/>
-          <w:sz w:val="28"/>
-          <w:szCs w:val="28"/>
-        </w:rPr>
-        <w:t>() → custom schema method to verify login password</w:t>
+      <w:r>
+        <w:rPr>
+          <w:rFonts w:ascii="Times New Roman" w:hAnsi="Times New Roman" w:cs="Times New Roman"/>
+          <w:sz w:val="28"/>
+          <w:szCs w:val="28"/>
+        </w:rPr>
+        <w:t>matchPassword() → custom schema method to verify login password</w:t>
       </w:r>
     </w:p>
     <w:p>
@@ -1526,7 +1381,6 @@
         </w:rPr>
         <w:br/>
       </w:r>
-      <w:proofErr w:type="spellStart"/>
       <w:r>
         <w:rPr>
           <w:rFonts w:ascii="Times New Roman" w:hAnsi="Times New Roman" w:cs="Times New Roman"/>
@@ -1535,62 +1389,7 @@
           <w:sz w:val="28"/>
           <w:szCs w:val="28"/>
         </w:rPr>
-        <w:t>npm</w:t>
-      </w:r>
-      <w:proofErr w:type="spellEnd"/>
-      <w:r>
-        <w:rPr>
-          <w:rFonts w:ascii="Times New Roman" w:hAnsi="Times New Roman" w:cs="Times New Roman"/>
-          <w:i/>
-          <w:iCs/>
-          <w:sz w:val="28"/>
-          <w:szCs w:val="28"/>
-        </w:rPr>
-        <w:t xml:space="preserve"> install </w:t>
-      </w:r>
-      <w:proofErr w:type="spellStart"/>
-      <w:r>
-        <w:rPr>
-          <w:rFonts w:ascii="Times New Roman" w:hAnsi="Times New Roman" w:cs="Times New Roman"/>
-          <w:i/>
-          <w:iCs/>
-          <w:sz w:val="28"/>
-          <w:szCs w:val="28"/>
-        </w:rPr>
-        <w:t>bcryptjs</w:t>
-      </w:r>
-      <w:proofErr w:type="spellEnd"/>
-      <w:r>
-        <w:rPr>
-          <w:rFonts w:ascii="Times New Roman" w:hAnsi="Times New Roman" w:cs="Times New Roman"/>
-          <w:i/>
-          <w:iCs/>
-          <w:sz w:val="28"/>
-          <w:szCs w:val="28"/>
-        </w:rPr>
-        <w:t xml:space="preserve"> </w:t>
-      </w:r>
-      <w:proofErr w:type="spellStart"/>
-      <w:r>
-        <w:rPr>
-          <w:rFonts w:ascii="Times New Roman" w:hAnsi="Times New Roman" w:cs="Times New Roman"/>
-          <w:i/>
-          <w:iCs/>
-          <w:sz w:val="28"/>
-          <w:szCs w:val="28"/>
-        </w:rPr>
-        <w:t>jsonwebtoken</w:t>
-      </w:r>
-      <w:proofErr w:type="spellEnd"/>
-      <w:r>
-        <w:rPr>
-          <w:rFonts w:ascii="Times New Roman" w:hAnsi="Times New Roman" w:cs="Times New Roman"/>
-          <w:i/>
-          <w:iCs/>
-          <w:sz w:val="28"/>
-          <w:szCs w:val="28"/>
-        </w:rPr>
-        <w:t xml:space="preserve"> in terminal</w:t>
+        <w:t>npm install bcryptjs jsonwebtoken in terminal</w:t>
       </w:r>
       <w:r>
         <w:rPr>
@@ -1746,95 +1545,41 @@
           <w:sz w:val="28"/>
           <w:szCs w:val="28"/>
         </w:rPr>
-        <w:t>POST /</w:t>
-      </w:r>
-      <w:proofErr w:type="spellStart"/>
-      <w:r>
-        <w:rPr>
-          <w:rFonts w:ascii="Times New Roman" w:hAnsi="Times New Roman" w:cs="Times New Roman"/>
-          <w:sz w:val="28"/>
-          <w:szCs w:val="28"/>
-        </w:rPr>
-        <w:t>api</w:t>
-      </w:r>
-      <w:proofErr w:type="spellEnd"/>
-      <w:r>
-        <w:rPr>
-          <w:rFonts w:ascii="Times New Roman" w:hAnsi="Times New Roman" w:cs="Times New Roman"/>
-          <w:sz w:val="28"/>
-          <w:szCs w:val="28"/>
-        </w:rPr>
-        <w:t>/auth/signup  → Register new user</w:t>
-      </w:r>
-    </w:p>
-    <w:p>
-      <w:pPr>
-        <w:rPr>
-          <w:rFonts w:ascii="Times New Roman" w:hAnsi="Times New Roman" w:cs="Times New Roman"/>
-          <w:sz w:val="28"/>
-          <w:szCs w:val="28"/>
-        </w:rPr>
-      </w:pPr>
-      <w:r>
-        <w:rPr>
-          <w:rFonts w:ascii="Times New Roman" w:hAnsi="Times New Roman" w:cs="Times New Roman"/>
-          <w:sz w:val="28"/>
-          <w:szCs w:val="28"/>
-        </w:rPr>
-        <w:t>POST /</w:t>
-      </w:r>
-      <w:proofErr w:type="spellStart"/>
-      <w:r>
-        <w:rPr>
-          <w:rFonts w:ascii="Times New Roman" w:hAnsi="Times New Roman" w:cs="Times New Roman"/>
-          <w:sz w:val="28"/>
-          <w:szCs w:val="28"/>
-        </w:rPr>
-        <w:t>api</w:t>
-      </w:r>
-      <w:proofErr w:type="spellEnd"/>
-      <w:r>
-        <w:rPr>
-          <w:rFonts w:ascii="Times New Roman" w:hAnsi="Times New Roman" w:cs="Times New Roman"/>
-          <w:sz w:val="28"/>
-          <w:szCs w:val="28"/>
-        </w:rPr>
-        <w:t>/auth/login   → Authenticate user</w:t>
-      </w:r>
-    </w:p>
-    <w:p>
-      <w:pPr>
-        <w:rPr>
-          <w:rFonts w:ascii="Times New Roman" w:hAnsi="Times New Roman" w:cs="Times New Roman"/>
-          <w:sz w:val="28"/>
-          <w:szCs w:val="28"/>
-        </w:rPr>
-      </w:pPr>
-      <w:r>
-        <w:rPr>
-          <w:rFonts w:ascii="Times New Roman" w:hAnsi="Times New Roman" w:cs="Times New Roman"/>
-          <w:sz w:val="28"/>
-          <w:szCs w:val="28"/>
-        </w:rPr>
-        <w:t>GET  /</w:t>
-      </w:r>
-      <w:proofErr w:type="spellStart"/>
-      <w:r>
-        <w:rPr>
-          <w:rFonts w:ascii="Times New Roman" w:hAnsi="Times New Roman" w:cs="Times New Roman"/>
-          <w:sz w:val="28"/>
-          <w:szCs w:val="28"/>
-        </w:rPr>
-        <w:t>api</w:t>
-      </w:r>
-      <w:proofErr w:type="spellEnd"/>
-      <w:r>
-        <w:rPr>
-          <w:rFonts w:ascii="Times New Roman" w:hAnsi="Times New Roman" w:cs="Times New Roman"/>
-          <w:sz w:val="28"/>
-          <w:szCs w:val="28"/>
-        </w:rPr>
-        <w:t>/auth/me      → Get logged-in user (protected)</w:t>
+        <w:t>POST /api/auth/signup  → Register new user</w:t>
+      </w:r>
+    </w:p>
+    <w:p>
+      <w:pPr>
+        <w:rPr>
+          <w:rFonts w:ascii="Times New Roman" w:hAnsi="Times New Roman" w:cs="Times New Roman"/>
+          <w:sz w:val="28"/>
+          <w:szCs w:val="28"/>
+        </w:rPr>
+      </w:pPr>
+      <w:r>
+        <w:rPr>
+          <w:rFonts w:ascii="Times New Roman" w:hAnsi="Times New Roman" w:cs="Times New Roman"/>
+          <w:sz w:val="28"/>
+          <w:szCs w:val="28"/>
+        </w:rPr>
+        <w:t>POST /api/auth/login   → Authenticate user</w:t>
+      </w:r>
+    </w:p>
+    <w:p>
+      <w:pPr>
+        <w:rPr>
+          <w:rFonts w:ascii="Times New Roman" w:hAnsi="Times New Roman" w:cs="Times New Roman"/>
+          <w:sz w:val="28"/>
+          <w:szCs w:val="28"/>
+        </w:rPr>
+      </w:pPr>
+      <w:r>
+        <w:rPr>
+          <w:rFonts w:ascii="Times New Roman" w:hAnsi="Times New Roman" w:cs="Times New Roman"/>
+          <w:sz w:val="28"/>
+          <w:szCs w:val="28"/>
+        </w:rPr>
+        <w:t>GET  /api/auth/me      → Get logged-in user (protected)</w:t>
       </w:r>
     </w:p>
     <w:p>
@@ -1868,23 +1613,13 @@
           <w:szCs w:val="28"/>
         </w:rPr>
       </w:pPr>
-      <w:proofErr w:type="spellStart"/>
-      <w:r>
-        <w:rPr>
-          <w:rFonts w:ascii="Times New Roman" w:hAnsi="Times New Roman" w:cs="Times New Roman"/>
-          <w:sz w:val="28"/>
-          <w:szCs w:val="28"/>
-        </w:rPr>
-        <w:t>jwt.sign</w:t>
-      </w:r>
-      <w:proofErr w:type="spellEnd"/>
-      <w:r>
-        <w:rPr>
-          <w:rFonts w:ascii="Times New Roman" w:hAnsi="Times New Roman" w:cs="Times New Roman"/>
-          <w:sz w:val="28"/>
-          <w:szCs w:val="28"/>
-        </w:rPr>
-        <w:t>() → creates a signed token containing user ID</w:t>
+      <w:r>
+        <w:rPr>
+          <w:rFonts w:ascii="Times New Roman" w:hAnsi="Times New Roman" w:cs="Times New Roman"/>
+          <w:sz w:val="28"/>
+          <w:szCs w:val="28"/>
+        </w:rPr>
+        <w:t>jwt.sign() → creates a signed token containing user ID</w:t>
       </w:r>
     </w:p>
     <w:p>
@@ -1942,41 +1677,13 @@
           <w:szCs w:val="28"/>
         </w:rPr>
       </w:pPr>
-      <w:proofErr w:type="spellStart"/>
-      <w:r>
-        <w:rPr>
-          <w:rFonts w:ascii="Times New Roman" w:hAnsi="Times New Roman" w:cs="Times New Roman"/>
-          <w:sz w:val="28"/>
-          <w:szCs w:val="28"/>
-        </w:rPr>
-        <w:t>matchPassword</w:t>
-      </w:r>
-      <w:proofErr w:type="spellEnd"/>
-      <w:r>
-        <w:rPr>
-          <w:rFonts w:ascii="Times New Roman" w:hAnsi="Times New Roman" w:cs="Times New Roman"/>
-          <w:sz w:val="28"/>
-          <w:szCs w:val="28"/>
-        </w:rPr>
-        <w:t xml:space="preserve">() → </w:t>
-      </w:r>
-      <w:proofErr w:type="spellStart"/>
-      <w:r>
-        <w:rPr>
-          <w:rFonts w:ascii="Times New Roman" w:hAnsi="Times New Roman" w:cs="Times New Roman"/>
-          <w:sz w:val="28"/>
-          <w:szCs w:val="28"/>
-        </w:rPr>
-        <w:t>bcrypt</w:t>
-      </w:r>
-      <w:proofErr w:type="spellEnd"/>
-      <w:r>
-        <w:rPr>
-          <w:rFonts w:ascii="Times New Roman" w:hAnsi="Times New Roman" w:cs="Times New Roman"/>
-          <w:sz w:val="28"/>
-          <w:szCs w:val="28"/>
-        </w:rPr>
-        <w:t xml:space="preserve"> compare during login</w:t>
+      <w:r>
+        <w:rPr>
+          <w:rFonts w:ascii="Times New Roman" w:hAnsi="Times New Roman" w:cs="Times New Roman"/>
+          <w:sz w:val="28"/>
+          <w:szCs w:val="28"/>
+        </w:rPr>
+        <w:t>matchPassword() → bcrypt compare during login</w:t>
       </w:r>
     </w:p>
     <w:p>
@@ -2166,23 +1873,13 @@
           <w:szCs w:val="28"/>
         </w:rPr>
       </w:pPr>
-      <w:proofErr w:type="spellStart"/>
-      <w:r>
-        <w:rPr>
-          <w:rFonts w:ascii="Times New Roman" w:hAnsi="Times New Roman" w:cs="Times New Roman"/>
-          <w:sz w:val="28"/>
-          <w:szCs w:val="28"/>
-        </w:rPr>
-        <w:t>jwt.verify</w:t>
-      </w:r>
-      <w:proofErr w:type="spellEnd"/>
-      <w:r>
-        <w:rPr>
-          <w:rFonts w:ascii="Times New Roman" w:hAnsi="Times New Roman" w:cs="Times New Roman"/>
-          <w:sz w:val="28"/>
-          <w:szCs w:val="28"/>
-        </w:rPr>
-        <w:t>() → validates token using secret key</w:t>
+      <w:r>
+        <w:rPr>
+          <w:rFonts w:ascii="Times New Roman" w:hAnsi="Times New Roman" w:cs="Times New Roman"/>
+          <w:sz w:val="28"/>
+          <w:szCs w:val="28"/>
+        </w:rPr>
+        <w:t>jwt.verify() → validates token using secret key</w:t>
       </w:r>
     </w:p>
     <w:p>
@@ -2197,23 +1894,13 @@
           <w:szCs w:val="28"/>
         </w:rPr>
       </w:pPr>
-      <w:proofErr w:type="spellStart"/>
-      <w:r>
-        <w:rPr>
-          <w:rFonts w:ascii="Times New Roman" w:hAnsi="Times New Roman" w:cs="Times New Roman"/>
-          <w:sz w:val="28"/>
-          <w:szCs w:val="28"/>
-        </w:rPr>
-        <w:t>req.user</w:t>
-      </w:r>
-      <w:proofErr w:type="spellEnd"/>
-      <w:r>
-        <w:rPr>
-          <w:rFonts w:ascii="Times New Roman" w:hAnsi="Times New Roman" w:cs="Times New Roman"/>
-          <w:sz w:val="28"/>
-          <w:szCs w:val="28"/>
-        </w:rPr>
-        <w:t xml:space="preserve"> → attaches logged-in user to every request</w:t>
+      <w:r>
+        <w:rPr>
+          <w:rFonts w:ascii="Times New Roman" w:hAnsi="Times New Roman" w:cs="Times New Roman"/>
+          <w:sz w:val="28"/>
+          <w:szCs w:val="28"/>
+        </w:rPr>
+        <w:t>req.user → attaches logged-in user to every request</w:t>
       </w:r>
     </w:p>
     <w:p>
@@ -3041,7 +2728,7 @@
           <w:szCs w:val="28"/>
         </w:rPr>
         <w:pict w14:anchorId="7F0BB463">
-          <v:rect id="_x0000_i1039" style="width:0;height:1.5pt" o:hralign="center" o:hrstd="t" o:hr="t" fillcolor="#a0a0a0" stroked="f"/>
+          <v:rect id="_x0000_i1033" style="width:0;height:1.5pt" o:hralign="center" o:hrstd="t" o:hr="t" fillcolor="#a0a0a0" stroked="f"/>
         </w:pict>
       </w:r>
     </w:p>
@@ -3099,25 +2786,7 @@
           <w:szCs w:val="28"/>
         </w:rPr>
         <w:br/>
-        <w:t xml:space="preserve">in </w:t>
-      </w:r>
-      <w:proofErr w:type="spellStart"/>
-      <w:r>
-        <w:rPr>
-          <w:rFonts w:ascii="Times New Roman" w:hAnsi="Times New Roman" w:cs="Times New Roman"/>
-          <w:sz w:val="28"/>
-          <w:szCs w:val="28"/>
-        </w:rPr>
-        <w:t>localStorage</w:t>
-      </w:r>
-      <w:proofErr w:type="spellEnd"/>
-      <w:r>
-        <w:rPr>
-          <w:rFonts w:ascii="Times New Roman" w:hAnsi="Times New Roman" w:cs="Times New Roman"/>
-          <w:sz w:val="28"/>
-          <w:szCs w:val="28"/>
-        </w:rPr>
-        <w:t xml:space="preserve"> after successful authentication.</w:t>
+        <w:t>in localStorage after successful authentication.</w:t>
       </w:r>
     </w:p>
     <w:p>
@@ -3172,23 +2841,13 @@
           <w:szCs w:val="28"/>
         </w:rPr>
       </w:pPr>
-      <w:proofErr w:type="spellStart"/>
-      <w:r>
-        <w:rPr>
-          <w:rFonts w:ascii="Times New Roman" w:hAnsi="Times New Roman" w:cs="Times New Roman"/>
-          <w:sz w:val="28"/>
-          <w:szCs w:val="28"/>
-        </w:rPr>
-        <w:t>localStorage</w:t>
-      </w:r>
-      <w:proofErr w:type="spellEnd"/>
-      <w:r>
-        <w:rPr>
-          <w:rFonts w:ascii="Times New Roman" w:hAnsi="Times New Roman" w:cs="Times New Roman"/>
-          <w:sz w:val="28"/>
-          <w:szCs w:val="28"/>
-        </w:rPr>
-        <w:t xml:space="preserve"> → persists token even after page refresh</w:t>
+      <w:r>
+        <w:rPr>
+          <w:rFonts w:ascii="Times New Roman" w:hAnsi="Times New Roman" w:cs="Times New Roman"/>
+          <w:sz w:val="28"/>
+          <w:szCs w:val="28"/>
+        </w:rPr>
+        <w:t>localStorage → persists token even after page refresh</w:t>
       </w:r>
     </w:p>
     <w:p>
@@ -3203,23 +2862,13 @@
           <w:szCs w:val="28"/>
         </w:rPr>
       </w:pPr>
-      <w:proofErr w:type="spellStart"/>
-      <w:r>
-        <w:rPr>
-          <w:rFonts w:ascii="Times New Roman" w:hAnsi="Times New Roman" w:cs="Times New Roman"/>
-          <w:sz w:val="28"/>
-          <w:szCs w:val="28"/>
-        </w:rPr>
-        <w:t>useAuth</w:t>
-      </w:r>
-      <w:proofErr w:type="spellEnd"/>
-      <w:r>
-        <w:rPr>
-          <w:rFonts w:ascii="Times New Roman" w:hAnsi="Times New Roman" w:cs="Times New Roman"/>
-          <w:sz w:val="28"/>
-          <w:szCs w:val="28"/>
-        </w:rPr>
-        <w:t>() → custom hook to access auth state anywhere</w:t>
+      <w:r>
+        <w:rPr>
+          <w:rFonts w:ascii="Times New Roman" w:hAnsi="Times New Roman" w:cs="Times New Roman"/>
+          <w:sz w:val="28"/>
+          <w:szCs w:val="28"/>
+        </w:rPr>
+        <w:t>useAuth() → custom hook to access auth state anywhere</w:t>
       </w:r>
     </w:p>
     <w:p>
@@ -3344,6 +2993,7 @@
       <w:r>
         <w:rPr>
           <w:rFonts w:ascii="Times New Roman" w:hAnsi="Times New Roman" w:cs="Times New Roman"/>
+          <w:noProof/>
           <w:sz w:val="28"/>
           <w:szCs w:val="28"/>
         </w:rPr>
@@ -3392,6 +3042,1943 @@
           <w:szCs w:val="28"/>
         </w:rPr>
       </w:pPr>
+      <w:r>
+        <w:rPr>
+          <w:rFonts w:ascii="Times New Roman" w:hAnsi="Times New Roman" w:cs="Times New Roman"/>
+          <w:sz w:val="28"/>
+          <w:szCs w:val="28"/>
+        </w:rPr>
+        <w:pict w14:anchorId="5BA0FAEA">
+          <v:rect id="_x0000_i1406" style="width:0;height:1.5pt" o:hralign="center" o:hrstd="t" o:hr="t" fillcolor="#a0a0a0" stroked="f"/>
+        </w:pict>
+      </w:r>
+    </w:p>
+    <w:p>
+      <w:pPr>
+        <w:rPr>
+          <w:rFonts w:ascii="Times New Roman" w:hAnsi="Times New Roman" w:cs="Times New Roman"/>
+          <w:b/>
+          <w:bCs/>
+          <w:sz w:val="28"/>
+          <w:szCs w:val="28"/>
+        </w:rPr>
+      </w:pPr>
+      <w:r>
+        <w:rPr>
+          <w:rFonts w:ascii="Times New Roman" w:hAnsi="Times New Roman" w:cs="Times New Roman"/>
+          <w:b/>
+          <w:bCs/>
+          <w:sz w:val="28"/>
+          <w:szCs w:val="28"/>
+        </w:rPr>
+        <w:t>Step 5 — Signup Page + Protected Routes</w:t>
+      </w:r>
+    </w:p>
+    <w:p>
+      <w:pPr>
+        <w:rPr>
+          <w:rFonts w:ascii="Times New Roman" w:hAnsi="Times New Roman" w:cs="Times New Roman"/>
+          <w:sz w:val="28"/>
+          <w:szCs w:val="28"/>
+        </w:rPr>
+      </w:pPr>
+      <w:r>
+        <w:rPr>
+          <w:rFonts w:ascii="Times New Roman" w:hAnsi="Times New Roman" w:cs="Times New Roman"/>
+          <w:sz w:val="28"/>
+          <w:szCs w:val="28"/>
+        </w:rPr>
+        <w:t>Built Signup page and Protected Route component that redirects</w:t>
+      </w:r>
+      <w:r>
+        <w:rPr>
+          <w:rFonts w:ascii="Times New Roman" w:hAnsi="Times New Roman" w:cs="Times New Roman"/>
+          <w:sz w:val="28"/>
+          <w:szCs w:val="28"/>
+        </w:rPr>
+        <w:br/>
+        <w:t>unauthenticated users to login page. Edit/Delete buttons hidden</w:t>
+      </w:r>
+      <w:r>
+        <w:rPr>
+          <w:rFonts w:ascii="Times New Roman" w:hAnsi="Times New Roman" w:cs="Times New Roman"/>
+          <w:sz w:val="28"/>
+          <w:szCs w:val="28"/>
+        </w:rPr>
+        <w:br/>
+        <w:t>when not logged in.</w:t>
+      </w:r>
+    </w:p>
+    <w:p>
+      <w:pPr>
+        <w:rPr>
+          <w:rFonts w:ascii="Times New Roman" w:hAnsi="Times New Roman" w:cs="Times New Roman"/>
+          <w:sz w:val="28"/>
+          <w:szCs w:val="28"/>
+        </w:rPr>
+      </w:pPr>
+      <w:r>
+        <w:rPr>
+          <w:rFonts w:ascii="Times New Roman" w:hAnsi="Times New Roman" w:cs="Times New Roman"/>
+          <w:b/>
+          <w:bCs/>
+          <w:sz w:val="28"/>
+          <w:szCs w:val="28"/>
+        </w:rPr>
+        <w:t>Key concepts:</w:t>
+      </w:r>
+    </w:p>
+    <w:p>
+      <w:pPr>
+        <w:numPr>
+          <w:ilvl w:val="0"/>
+          <w:numId w:val="5"/>
+        </w:numPr>
+        <w:rPr>
+          <w:rFonts w:ascii="Times New Roman" w:hAnsi="Times New Roman" w:cs="Times New Roman"/>
+          <w:sz w:val="28"/>
+          <w:szCs w:val="28"/>
+        </w:rPr>
+      </w:pPr>
+      <w:r>
+        <w:rPr>
+          <w:rFonts w:ascii="Times New Roman" w:hAnsi="Times New Roman" w:cs="Times New Roman"/>
+          <w:sz w:val="28"/>
+          <w:szCs w:val="28"/>
+        </w:rPr>
+        <w:t>ProtectedRoute → wraps private pages, redirects if not logged in</w:t>
+      </w:r>
+    </w:p>
+    <w:p>
+      <w:pPr>
+        <w:numPr>
+          <w:ilvl w:val="0"/>
+          <w:numId w:val="5"/>
+        </w:numPr>
+        <w:rPr>
+          <w:rFonts w:ascii="Times New Roman" w:hAnsi="Times New Roman" w:cs="Times New Roman"/>
+          <w:sz w:val="28"/>
+          <w:szCs w:val="28"/>
+        </w:rPr>
+      </w:pPr>
+      <w:r>
+        <w:rPr>
+          <w:rFonts w:ascii="Times New Roman" w:hAnsi="Times New Roman" w:cs="Times New Roman"/>
+          <w:sz w:val="28"/>
+          <w:szCs w:val="28"/>
+        </w:rPr>
+        <w:t>&lt;Navigate to="/login" /&gt; → programmatic redirect</w:t>
+      </w:r>
+    </w:p>
+    <w:p>
+      <w:pPr>
+        <w:numPr>
+          <w:ilvl w:val="0"/>
+          <w:numId w:val="5"/>
+        </w:numPr>
+        <w:rPr>
+          <w:rFonts w:ascii="Times New Roman" w:hAnsi="Times New Roman" w:cs="Times New Roman"/>
+          <w:sz w:val="28"/>
+          <w:szCs w:val="28"/>
+        </w:rPr>
+      </w:pPr>
+      <w:r>
+        <w:rPr>
+          <w:rFonts w:ascii="Times New Roman" w:hAnsi="Times New Roman" w:cs="Times New Roman"/>
+          <w:sz w:val="28"/>
+          <w:szCs w:val="28"/>
+        </w:rPr>
+        <w:lastRenderedPageBreak/>
+        <w:t>Conditional rendering → show/hide buttons based on isLoggedIn</w:t>
+      </w:r>
+    </w:p>
+    <w:p>
+      <w:pPr>
+        <w:numPr>
+          <w:ilvl w:val="0"/>
+          <w:numId w:val="5"/>
+        </w:numPr>
+        <w:rPr>
+          <w:rFonts w:ascii="Times New Roman" w:hAnsi="Times New Roman" w:cs="Times New Roman"/>
+          <w:sz w:val="28"/>
+          <w:szCs w:val="28"/>
+        </w:rPr>
+      </w:pPr>
+      <w:r>
+        <w:rPr>
+          <w:rFonts w:ascii="Times New Roman" w:hAnsi="Times New Roman" w:cs="Times New Roman"/>
+          <w:sz w:val="28"/>
+          <w:szCs w:val="28"/>
+        </w:rPr>
+        <w:t>localStorage → token persists even after page refresh</w:t>
+      </w:r>
+    </w:p>
+    <w:p>
+      <w:pPr>
+        <w:rPr>
+          <w:rFonts w:ascii="Times New Roman" w:hAnsi="Times New Roman" w:cs="Times New Roman"/>
+          <w:sz w:val="28"/>
+          <w:szCs w:val="28"/>
+        </w:rPr>
+      </w:pPr>
+      <w:r>
+        <w:rPr>
+          <w:rFonts w:ascii="Times New Roman" w:hAnsi="Times New Roman" w:cs="Times New Roman"/>
+          <w:b/>
+          <w:bCs/>
+          <w:sz w:val="28"/>
+          <w:szCs w:val="28"/>
+        </w:rPr>
+        <w:t>Security behavior:</w:t>
+      </w:r>
+    </w:p>
+    <w:p>
+      <w:pPr>
+        <w:rPr>
+          <w:rFonts w:ascii="Times New Roman" w:hAnsi="Times New Roman" w:cs="Times New Roman"/>
+          <w:sz w:val="28"/>
+          <w:szCs w:val="28"/>
+        </w:rPr>
+      </w:pPr>
+      <w:r>
+        <w:rPr>
+          <w:rFonts w:ascii="Times New Roman" w:hAnsi="Times New Roman" w:cs="Times New Roman"/>
+          <w:sz w:val="28"/>
+          <w:szCs w:val="28"/>
+        </w:rPr>
+        <w:t>Not logged in:</w:t>
+      </w:r>
+    </w:p>
+    <w:p>
+      <w:pPr>
+        <w:rPr>
+          <w:rFonts w:ascii="Times New Roman" w:hAnsi="Times New Roman" w:cs="Times New Roman"/>
+          <w:sz w:val="28"/>
+          <w:szCs w:val="28"/>
+        </w:rPr>
+      </w:pPr>
+      <w:r>
+        <w:rPr>
+          <w:rFonts w:ascii="Times New Roman" w:hAnsi="Times New Roman" w:cs="Times New Roman"/>
+          <w:sz w:val="28"/>
+          <w:szCs w:val="28"/>
+        </w:rPr>
+        <w:t>→ /add redirects to /login</w:t>
+      </w:r>
+    </w:p>
+    <w:p>
+      <w:pPr>
+        <w:rPr>
+          <w:rFonts w:ascii="Times New Roman" w:hAnsi="Times New Roman" w:cs="Times New Roman"/>
+          <w:sz w:val="28"/>
+          <w:szCs w:val="28"/>
+        </w:rPr>
+      </w:pPr>
+      <w:r>
+        <w:rPr>
+          <w:rFonts w:ascii="Times New Roman" w:hAnsi="Times New Roman" w:cs="Times New Roman"/>
+          <w:sz w:val="28"/>
+          <w:szCs w:val="28"/>
+        </w:rPr>
+        <w:t>→ /edit/:id redirects to /login</w:t>
+      </w:r>
+    </w:p>
+    <w:p>
+      <w:pPr>
+        <w:rPr>
+          <w:rFonts w:ascii="Times New Roman" w:hAnsi="Times New Roman" w:cs="Times New Roman"/>
+          <w:sz w:val="28"/>
+          <w:szCs w:val="28"/>
+        </w:rPr>
+      </w:pPr>
+      <w:r>
+        <w:rPr>
+          <w:rFonts w:ascii="Times New Roman" w:hAnsi="Times New Roman" w:cs="Times New Roman"/>
+          <w:sz w:val="28"/>
+          <w:szCs w:val="28"/>
+        </w:rPr>
+        <w:t>→ Edit/Delete buttons hidden on cards</w:t>
+      </w:r>
+    </w:p>
+    <w:p>
+      <w:pPr>
+        <w:rPr>
+          <w:rFonts w:ascii="Times New Roman" w:hAnsi="Times New Roman" w:cs="Times New Roman"/>
+          <w:sz w:val="28"/>
+          <w:szCs w:val="28"/>
+        </w:rPr>
+      </w:pPr>
+    </w:p>
+    <w:p>
+      <w:pPr>
+        <w:rPr>
+          <w:rFonts w:ascii="Times New Roman" w:hAnsi="Times New Roman" w:cs="Times New Roman"/>
+          <w:sz w:val="28"/>
+          <w:szCs w:val="28"/>
+        </w:rPr>
+      </w:pPr>
+      <w:r>
+        <w:rPr>
+          <w:rFonts w:ascii="Times New Roman" w:hAnsi="Times New Roman" w:cs="Times New Roman"/>
+          <w:sz w:val="28"/>
+          <w:szCs w:val="28"/>
+        </w:rPr>
+        <w:t>Logged in:</w:t>
+      </w:r>
+    </w:p>
+    <w:p>
+      <w:pPr>
+        <w:rPr>
+          <w:rFonts w:ascii="Times New Roman" w:hAnsi="Times New Roman" w:cs="Times New Roman"/>
+          <w:sz w:val="28"/>
+          <w:szCs w:val="28"/>
+        </w:rPr>
+      </w:pPr>
+      <w:r>
+        <w:rPr>
+          <w:rFonts w:ascii="Times New Roman" w:hAnsi="Times New Roman" w:cs="Times New Roman"/>
+          <w:sz w:val="28"/>
+          <w:szCs w:val="28"/>
+        </w:rPr>
+        <w:t>→ All pages accessible</w:t>
+      </w:r>
+    </w:p>
+    <w:p>
+      <w:pPr>
+        <w:rPr>
+          <w:rFonts w:ascii="Times New Roman" w:hAnsi="Times New Roman" w:cs="Times New Roman"/>
+          <w:sz w:val="28"/>
+          <w:szCs w:val="28"/>
+        </w:rPr>
+      </w:pPr>
+      <w:r>
+        <w:rPr>
+          <w:rFonts w:ascii="Times New Roman" w:hAnsi="Times New Roman" w:cs="Times New Roman"/>
+          <w:sz w:val="28"/>
+          <w:szCs w:val="28"/>
+        </w:rPr>
+        <w:t>→ Edit/Delete buttons visible</w:t>
+      </w:r>
+    </w:p>
+    <w:p>
+      <w:pPr>
+        <w:rPr>
+          <w:rFonts w:ascii="Times New Roman" w:hAnsi="Times New Roman" w:cs="Times New Roman"/>
+          <w:sz w:val="28"/>
+          <w:szCs w:val="28"/>
+        </w:rPr>
+      </w:pPr>
+      <w:r>
+        <w:rPr>
+          <w:rFonts w:ascii="Times New Roman" w:hAnsi="Times New Roman" w:cs="Times New Roman"/>
+          <w:sz w:val="28"/>
+          <w:szCs w:val="28"/>
+        </w:rPr>
+        <w:t>→ Token sent with every protected API call</w:t>
+      </w:r>
+    </w:p>
+    <w:p>
+      <w:pPr>
+        <w:rPr>
+          <w:rFonts w:ascii="Times New Roman" w:hAnsi="Times New Roman" w:cs="Times New Roman"/>
+          <w:i/>
+          <w:iCs/>
+          <w:sz w:val="28"/>
+          <w:szCs w:val="28"/>
+        </w:rPr>
+      </w:pPr>
+      <w:r>
+        <w:rPr>
+          <w:rFonts w:ascii="Times New Roman" w:hAnsi="Times New Roman" w:cs="Times New Roman"/>
+          <w:sz w:val="28"/>
+          <w:szCs w:val="28"/>
+        </w:rPr>
+        <w:drawing>
+          <wp:anchor distT="0" distB="0" distL="114300" distR="114300" simplePos="0" relativeHeight="251668480" behindDoc="0" locked="0" layoutInCell="1" allowOverlap="1" wp14:anchorId="2FE593B4" wp14:editId="6D9BE9BC">
+            <wp:simplePos x="0" y="0"/>
+            <wp:positionH relativeFrom="column">
+              <wp:posOffset>638667</wp:posOffset>
+            </wp:positionH>
+            <wp:positionV relativeFrom="paragraph">
+              <wp:posOffset>299796</wp:posOffset>
+            </wp:positionV>
+            <wp:extent cx="3923451" cy="4500000"/>
+            <wp:effectExtent l="0" t="0" r="1270" b="0"/>
+            <wp:wrapTopAndBottom/>
+            <wp:docPr id="12" name="Picture 12"/>
+            <wp:cNvGraphicFramePr>
+              <a:graphicFrameLocks xmlns:a="http://schemas.openxmlformats.org/drawingml/2006/main" noChangeAspect="1"/>
+            </wp:cNvGraphicFramePr>
+            <a:graphic xmlns:a="http://schemas.openxmlformats.org/drawingml/2006/main">
+              <a:graphicData uri="http://schemas.openxmlformats.org/drawingml/2006/picture">
+                <pic:pic xmlns:pic="http://schemas.openxmlformats.org/drawingml/2006/picture">
+                  <pic:nvPicPr>
+                    <pic:cNvPr id="1" name=""/>
+                    <pic:cNvPicPr/>
+                  </pic:nvPicPr>
+                  <pic:blipFill>
+                    <a:blip r:embed="rId14">
+                      <a:extLst>
+                        <a:ext uri="{28A0092B-C50C-407E-A947-70E740481C1C}">
+                          <a14:useLocalDpi xmlns:a14="http://schemas.microsoft.com/office/drawing/2010/main" val="0"/>
+                        </a:ext>
+                      </a:extLst>
+                    </a:blip>
+                    <a:stretch>
+                      <a:fillRect/>
+                    </a:stretch>
+                  </pic:blipFill>
+                  <pic:spPr>
+                    <a:xfrm>
+                      <a:off x="0" y="0"/>
+                      <a:ext cx="3923451" cy="4500000"/>
+                    </a:xfrm>
+                    <a:prstGeom prst="rect">
+                      <a:avLst/>
+                    </a:prstGeom>
+                  </pic:spPr>
+                </pic:pic>
+              </a:graphicData>
+            </a:graphic>
+            <wp14:sizeRelH relativeFrom="page">
+              <wp14:pctWidth>0</wp14:pctWidth>
+            </wp14:sizeRelH>
+            <wp14:sizeRelV relativeFrom="page">
+              <wp14:pctHeight>0</wp14:pctHeight>
+            </wp14:sizeRelV>
+          </wp:anchor>
+        </w:drawing>
+      </w:r>
+      <w:r>
+        <w:rPr>
+          <w:rFonts w:ascii="Times New Roman" w:hAnsi="Times New Roman" w:cs="Times New Roman"/>
+          <w:i/>
+          <w:iCs/>
+          <w:sz w:val="28"/>
+          <w:szCs w:val="28"/>
+        </w:rPr>
+        <w:t xml:space="preserve"> Signup page</w:t>
+      </w:r>
+    </w:p>
+    <w:p>
+      <w:pPr>
+        <w:rPr>
+          <w:rFonts w:ascii="Times New Roman" w:hAnsi="Times New Roman" w:cs="Times New Roman"/>
+          <w:sz w:val="28"/>
+          <w:szCs w:val="28"/>
+        </w:rPr>
+      </w:pPr>
+    </w:p>
+    <w:p>
+      <w:pPr>
+        <w:rPr>
+          <w:rFonts w:ascii="Times New Roman" w:hAnsi="Times New Roman" w:cs="Times New Roman"/>
+          <w:sz w:val="28"/>
+          <w:szCs w:val="28"/>
+        </w:rPr>
+      </w:pPr>
+      <w:r>
+        <w:rPr>
+          <w:rFonts w:ascii="Times New Roman" w:hAnsi="Times New Roman" w:cs="Times New Roman"/>
+          <w:sz w:val="28"/>
+          <w:szCs w:val="28"/>
+        </w:rPr>
+        <w:pict w14:anchorId="49C6C9F6">
+          <v:rect id="_x0000_i1424" style="width:0;height:1.5pt" o:hralign="center" o:hrstd="t" o:hr="t" fillcolor="#a0a0a0" stroked="f"/>
+        </w:pict>
+      </w:r>
+    </w:p>
+    <w:p>
+      <w:pPr>
+        <w:rPr>
+          <w:rFonts w:ascii="Times New Roman" w:hAnsi="Times New Roman" w:cs="Times New Roman"/>
+          <w:b/>
+          <w:bCs/>
+          <w:sz w:val="28"/>
+          <w:szCs w:val="28"/>
+        </w:rPr>
+      </w:pPr>
+      <w:r>
+        <w:rPr>
+          <w:rFonts w:ascii="Times New Roman" w:hAnsi="Times New Roman" w:cs="Times New Roman"/>
+          <w:b/>
+          <w:bCs/>
+          <w:sz w:val="28"/>
+          <w:szCs w:val="28"/>
+        </w:rPr>
+        <w:t>Security Notes — JWT Authentication</w:t>
+      </w:r>
+    </w:p>
+    <w:p>
+      <w:pPr>
+        <w:rPr>
+          <w:rFonts w:ascii="Times New Roman" w:hAnsi="Times New Roman" w:cs="Times New Roman"/>
+          <w:sz w:val="28"/>
+          <w:szCs w:val="28"/>
+        </w:rPr>
+      </w:pPr>
+      <w:r>
+        <w:rPr>
+          <w:rFonts w:ascii="Times New Roman" w:hAnsi="Times New Roman" w:cs="Times New Roman"/>
+          <w:sz w:val="28"/>
+          <w:szCs w:val="28"/>
+        </w:rPr>
+        <w:pict w14:anchorId="6B4885ED">
+          <v:rect id="_x0000_i1462" style="width:0;height:1.5pt" o:hralign="center" o:hrstd="t" o:hr="t" fillcolor="#a0a0a0" stroked="f"/>
+        </w:pict>
+      </w:r>
+    </w:p>
+    <w:p>
+      <w:pPr>
+        <w:rPr>
+          <w:rFonts w:ascii="Times New Roman" w:hAnsi="Times New Roman" w:cs="Times New Roman"/>
+          <w:b/>
+          <w:bCs/>
+          <w:sz w:val="28"/>
+          <w:szCs w:val="28"/>
+        </w:rPr>
+      </w:pPr>
+      <w:r>
+        <w:rPr>
+          <w:rFonts w:ascii="Times New Roman" w:hAnsi="Times New Roman" w:cs="Times New Roman"/>
+          <w:b/>
+          <w:bCs/>
+          <w:sz w:val="28"/>
+          <w:szCs w:val="28"/>
+        </w:rPr>
+        <w:t>1. Where to Store JWT Tokens?</w:t>
+      </w:r>
+    </w:p>
+    <w:p>
+      <w:pPr>
+        <w:rPr>
+          <w:rFonts w:ascii="Times New Roman" w:hAnsi="Times New Roman" w:cs="Times New Roman"/>
+          <w:sz w:val="28"/>
+          <w:szCs w:val="28"/>
+        </w:rPr>
+      </w:pPr>
+      <w:r>
+        <w:rPr>
+          <w:rFonts w:ascii="Times New Roman" w:hAnsi="Times New Roman" w:cs="Times New Roman"/>
+          <w:sz w:val="28"/>
+          <w:szCs w:val="28"/>
+        </w:rPr>
+        <w:t>Option A → localStorage (What we used)</w:t>
+      </w:r>
+    </w:p>
+    <w:p>
+      <w:pPr>
+        <w:rPr>
+          <w:rFonts w:ascii="Times New Roman" w:hAnsi="Times New Roman" w:cs="Times New Roman"/>
+          <w:sz w:val="28"/>
+          <w:szCs w:val="28"/>
+        </w:rPr>
+      </w:pPr>
+      <w:r>
+        <w:rPr>
+          <w:rFonts w:ascii="Segoe UI Emoji" w:hAnsi="Segoe UI Emoji" w:cs="Segoe UI Emoji"/>
+          <w:sz w:val="28"/>
+          <w:szCs w:val="28"/>
+        </w:rPr>
+        <w:t>✅</w:t>
+      </w:r>
+      <w:r>
+        <w:rPr>
+          <w:rFonts w:ascii="Times New Roman" w:hAnsi="Times New Roman" w:cs="Times New Roman"/>
+          <w:sz w:val="28"/>
+          <w:szCs w:val="28"/>
+        </w:rPr>
+        <w:t xml:space="preserve"> Simple to implement</w:t>
+      </w:r>
+    </w:p>
+    <w:p>
+      <w:pPr>
+        <w:rPr>
+          <w:rFonts w:ascii="Times New Roman" w:hAnsi="Times New Roman" w:cs="Times New Roman"/>
+          <w:sz w:val="28"/>
+          <w:szCs w:val="28"/>
+        </w:rPr>
+      </w:pPr>
+      <w:r>
+        <w:rPr>
+          <w:rFonts w:ascii="Segoe UI Emoji" w:hAnsi="Segoe UI Emoji" w:cs="Segoe UI Emoji"/>
+          <w:sz w:val="28"/>
+          <w:szCs w:val="28"/>
+        </w:rPr>
+        <w:t>✅</w:t>
+      </w:r>
+      <w:r>
+        <w:rPr>
+          <w:rFonts w:ascii="Times New Roman" w:hAnsi="Times New Roman" w:cs="Times New Roman"/>
+          <w:sz w:val="28"/>
+          <w:szCs w:val="28"/>
+        </w:rPr>
+        <w:t xml:space="preserve"> Works well for learning projects</w:t>
+      </w:r>
+    </w:p>
+    <w:p>
+      <w:pPr>
+        <w:rPr>
+          <w:rFonts w:ascii="Times New Roman" w:hAnsi="Times New Roman" w:cs="Times New Roman"/>
+          <w:sz w:val="28"/>
+          <w:szCs w:val="28"/>
+        </w:rPr>
+      </w:pPr>
+      <w:r>
+        <w:rPr>
+          <w:rFonts w:ascii="Segoe UI Emoji" w:hAnsi="Segoe UI Emoji" w:cs="Segoe UI Emoji"/>
+          <w:sz w:val="28"/>
+          <w:szCs w:val="28"/>
+        </w:rPr>
+        <w:t>❌</w:t>
+      </w:r>
+      <w:r>
+        <w:rPr>
+          <w:rFonts w:ascii="Times New Roman" w:hAnsi="Times New Roman" w:cs="Times New Roman"/>
+          <w:sz w:val="28"/>
+          <w:szCs w:val="28"/>
+        </w:rPr>
+        <w:t xml:space="preserve"> Vulnerable to XSS attacks</w:t>
+      </w:r>
+    </w:p>
+    <w:p>
+      <w:pPr>
+        <w:rPr>
+          <w:rFonts w:ascii="Times New Roman" w:hAnsi="Times New Roman" w:cs="Times New Roman"/>
+          <w:sz w:val="28"/>
+          <w:szCs w:val="28"/>
+        </w:rPr>
+      </w:pPr>
+      <w:r>
+        <w:rPr>
+          <w:rFonts w:ascii="Times New Roman" w:hAnsi="Times New Roman" w:cs="Times New Roman"/>
+          <w:sz w:val="28"/>
+          <w:szCs w:val="28"/>
+        </w:rPr>
+        <w:t xml:space="preserve">   (malicious scripts can read it)</w:t>
+      </w:r>
+    </w:p>
+    <w:p>
+      <w:pPr>
+        <w:rPr>
+          <w:rFonts w:ascii="Times New Roman" w:hAnsi="Times New Roman" w:cs="Times New Roman"/>
+          <w:sz w:val="28"/>
+          <w:szCs w:val="28"/>
+        </w:rPr>
+      </w:pPr>
+    </w:p>
+    <w:p>
+      <w:pPr>
+        <w:rPr>
+          <w:rFonts w:ascii="Times New Roman" w:hAnsi="Times New Roman" w:cs="Times New Roman"/>
+          <w:sz w:val="28"/>
+          <w:szCs w:val="28"/>
+        </w:rPr>
+      </w:pPr>
+      <w:r>
+        <w:rPr>
+          <w:rFonts w:ascii="Times New Roman" w:hAnsi="Times New Roman" w:cs="Times New Roman"/>
+          <w:sz w:val="28"/>
+          <w:szCs w:val="28"/>
+        </w:rPr>
+        <w:t>Option B → httpOnly Cookie (Recommended for Production)</w:t>
+      </w:r>
+    </w:p>
+    <w:p>
+      <w:pPr>
+        <w:rPr>
+          <w:rFonts w:ascii="Times New Roman" w:hAnsi="Times New Roman" w:cs="Times New Roman"/>
+          <w:sz w:val="28"/>
+          <w:szCs w:val="28"/>
+        </w:rPr>
+      </w:pPr>
+      <w:r>
+        <w:rPr>
+          <w:rFonts w:ascii="Segoe UI Emoji" w:hAnsi="Segoe UI Emoji" w:cs="Segoe UI Emoji"/>
+          <w:sz w:val="28"/>
+          <w:szCs w:val="28"/>
+        </w:rPr>
+        <w:t>✅</w:t>
+      </w:r>
+      <w:r>
+        <w:rPr>
+          <w:rFonts w:ascii="Times New Roman" w:hAnsi="Times New Roman" w:cs="Times New Roman"/>
+          <w:sz w:val="28"/>
+          <w:szCs w:val="28"/>
+        </w:rPr>
+        <w:t xml:space="preserve"> JavaScript CANNOT access it</w:t>
+      </w:r>
+    </w:p>
+    <w:p>
+      <w:pPr>
+        <w:rPr>
+          <w:rFonts w:ascii="Times New Roman" w:hAnsi="Times New Roman" w:cs="Times New Roman"/>
+          <w:sz w:val="28"/>
+          <w:szCs w:val="28"/>
+        </w:rPr>
+      </w:pPr>
+      <w:r>
+        <w:rPr>
+          <w:rFonts w:ascii="Segoe UI Emoji" w:hAnsi="Segoe UI Emoji" w:cs="Segoe UI Emoji"/>
+          <w:sz w:val="28"/>
+          <w:szCs w:val="28"/>
+        </w:rPr>
+        <w:t>✅</w:t>
+      </w:r>
+      <w:r>
+        <w:rPr>
+          <w:rFonts w:ascii="Times New Roman" w:hAnsi="Times New Roman" w:cs="Times New Roman"/>
+          <w:sz w:val="28"/>
+          <w:szCs w:val="28"/>
+        </w:rPr>
+        <w:t xml:space="preserve"> More secure against XSS</w:t>
+      </w:r>
+    </w:p>
+    <w:p>
+      <w:pPr>
+        <w:rPr>
+          <w:rFonts w:ascii="Times New Roman" w:hAnsi="Times New Roman" w:cs="Times New Roman"/>
+          <w:sz w:val="28"/>
+          <w:szCs w:val="28"/>
+        </w:rPr>
+      </w:pPr>
+      <w:r>
+        <w:rPr>
+          <w:rFonts w:ascii="Segoe UI Emoji" w:hAnsi="Segoe UI Emoji" w:cs="Segoe UI Emoji"/>
+          <w:sz w:val="28"/>
+          <w:szCs w:val="28"/>
+        </w:rPr>
+        <w:t>✅</w:t>
+      </w:r>
+      <w:r>
+        <w:rPr>
+          <w:rFonts w:ascii="Times New Roman" w:hAnsi="Times New Roman" w:cs="Times New Roman"/>
+          <w:sz w:val="28"/>
+          <w:szCs w:val="28"/>
+        </w:rPr>
+        <w:t xml:space="preserve"> Browser handles it automatically</w:t>
+      </w:r>
+    </w:p>
+    <w:p>
+      <w:pPr>
+        <w:rPr>
+          <w:rFonts w:ascii="Times New Roman" w:hAnsi="Times New Roman" w:cs="Times New Roman"/>
+          <w:sz w:val="28"/>
+          <w:szCs w:val="28"/>
+        </w:rPr>
+      </w:pPr>
+      <w:r>
+        <w:rPr>
+          <w:rFonts w:ascii="Segoe UI Emoji" w:hAnsi="Segoe UI Emoji" w:cs="Segoe UI Emoji"/>
+          <w:sz w:val="28"/>
+          <w:szCs w:val="28"/>
+        </w:rPr>
+        <w:t>❌</w:t>
+      </w:r>
+      <w:r>
+        <w:rPr>
+          <w:rFonts w:ascii="Times New Roman" w:hAnsi="Times New Roman" w:cs="Times New Roman"/>
+          <w:sz w:val="28"/>
+          <w:szCs w:val="28"/>
+        </w:rPr>
+        <w:t xml:space="preserve"> Needs extra CSRF protection</w:t>
+      </w:r>
+    </w:p>
+    <w:p>
+      <w:pPr>
+        <w:rPr>
+          <w:rFonts w:ascii="Times New Roman" w:hAnsi="Times New Roman" w:cs="Times New Roman"/>
+          <w:sz w:val="28"/>
+          <w:szCs w:val="28"/>
+        </w:rPr>
+      </w:pPr>
+      <w:r>
+        <w:rPr>
+          <w:rFonts w:ascii="Segoe UI Emoji" w:hAnsi="Segoe UI Emoji" w:cs="Segoe UI Emoji"/>
+          <w:sz w:val="28"/>
+          <w:szCs w:val="28"/>
+        </w:rPr>
+        <w:t>❌</w:t>
+      </w:r>
+      <w:r>
+        <w:rPr>
+          <w:rFonts w:ascii="Times New Roman" w:hAnsi="Times New Roman" w:cs="Times New Roman"/>
+          <w:sz w:val="28"/>
+          <w:szCs w:val="28"/>
+        </w:rPr>
+        <w:t xml:space="preserve"> More complex to implement</w:t>
+      </w:r>
+    </w:p>
+    <w:p>
+      <w:pPr>
+        <w:rPr>
+          <w:rFonts w:ascii="Times New Roman" w:hAnsi="Times New Roman" w:cs="Times New Roman"/>
+          <w:sz w:val="28"/>
+          <w:szCs w:val="28"/>
+        </w:rPr>
+      </w:pPr>
+    </w:p>
+    <w:p>
+      <w:pPr>
+        <w:rPr>
+          <w:rFonts w:ascii="Times New Roman" w:hAnsi="Times New Roman" w:cs="Times New Roman"/>
+          <w:sz w:val="28"/>
+          <w:szCs w:val="28"/>
+        </w:rPr>
+      </w:pPr>
+      <w:r>
+        <w:rPr>
+          <w:rFonts w:ascii="Times New Roman" w:hAnsi="Times New Roman" w:cs="Times New Roman"/>
+          <w:sz w:val="28"/>
+          <w:szCs w:val="28"/>
+        </w:rPr>
+        <w:t>For this internship project → localStorage is acceptable</w:t>
+      </w:r>
+    </w:p>
+    <w:p>
+      <w:pPr>
+        <w:rPr>
+          <w:rFonts w:ascii="Times New Roman" w:hAnsi="Times New Roman" w:cs="Times New Roman"/>
+          <w:sz w:val="28"/>
+          <w:szCs w:val="28"/>
+        </w:rPr>
+      </w:pPr>
+      <w:r>
+        <w:rPr>
+          <w:rFonts w:ascii="Times New Roman" w:hAnsi="Times New Roman" w:cs="Times New Roman"/>
+          <w:sz w:val="28"/>
+          <w:szCs w:val="28"/>
+        </w:rPr>
+        <w:t>For real production apps → use httpOnly cookies</w:t>
+      </w:r>
+    </w:p>
+    <w:p>
+      <w:pPr>
+        <w:rPr>
+          <w:rFonts w:ascii="Times New Roman" w:hAnsi="Times New Roman" w:cs="Times New Roman"/>
+          <w:sz w:val="28"/>
+          <w:szCs w:val="28"/>
+        </w:rPr>
+      </w:pPr>
+      <w:r>
+        <w:rPr>
+          <w:rFonts w:ascii="Times New Roman" w:hAnsi="Times New Roman" w:cs="Times New Roman"/>
+          <w:sz w:val="28"/>
+          <w:szCs w:val="28"/>
+        </w:rPr>
+        <w:pict w14:anchorId="5846BB73">
+          <v:rect id="_x0000_i1463" style="width:0;height:1.5pt" o:hralign="center" o:hrstd="t" o:hr="t" fillcolor="#a0a0a0" stroked="f"/>
+        </w:pict>
+      </w:r>
+    </w:p>
+    <w:p>
+      <w:pPr>
+        <w:rPr>
+          <w:rFonts w:ascii="Times New Roman" w:hAnsi="Times New Roman" w:cs="Times New Roman"/>
+          <w:b/>
+          <w:bCs/>
+          <w:sz w:val="28"/>
+          <w:szCs w:val="28"/>
+        </w:rPr>
+      </w:pPr>
+      <w:r>
+        <w:rPr>
+          <w:rFonts w:ascii="Times New Roman" w:hAnsi="Times New Roman" w:cs="Times New Roman"/>
+          <w:b/>
+          <w:bCs/>
+          <w:sz w:val="28"/>
+          <w:szCs w:val="28"/>
+        </w:rPr>
+        <w:t>2. Common Security Pitfalls</w:t>
+      </w:r>
+    </w:p>
+    <w:p>
+      <w:pPr>
+        <w:rPr>
+          <w:rFonts w:ascii="Times New Roman" w:hAnsi="Times New Roman" w:cs="Times New Roman"/>
+          <w:sz w:val="28"/>
+          <w:szCs w:val="28"/>
+        </w:rPr>
+      </w:pPr>
+      <w:r>
+        <w:rPr>
+          <w:rFonts w:ascii="Times New Roman" w:hAnsi="Times New Roman" w:cs="Times New Roman"/>
+          <w:sz w:val="28"/>
+          <w:szCs w:val="28"/>
+        </w:rPr>
+        <w:t>Pitfall 1 — Weak JWT Secret</w:t>
+      </w:r>
+    </w:p>
+    <w:p>
+      <w:pPr>
+        <w:rPr>
+          <w:rFonts w:ascii="Times New Roman" w:hAnsi="Times New Roman" w:cs="Times New Roman"/>
+          <w:sz w:val="28"/>
+          <w:szCs w:val="28"/>
+        </w:rPr>
+      </w:pPr>
+      <w:r>
+        <w:rPr>
+          <w:rFonts w:ascii="Segoe UI Emoji" w:hAnsi="Segoe UI Emoji" w:cs="Segoe UI Emoji"/>
+          <w:sz w:val="28"/>
+          <w:szCs w:val="28"/>
+        </w:rPr>
+        <w:t>❌</w:t>
+      </w:r>
+      <w:r>
+        <w:rPr>
+          <w:rFonts w:ascii="Times New Roman" w:hAnsi="Times New Roman" w:cs="Times New Roman"/>
+          <w:sz w:val="28"/>
+          <w:szCs w:val="28"/>
+        </w:rPr>
+        <w:t xml:space="preserve"> JWT_SECRET=secret</w:t>
+      </w:r>
+    </w:p>
+    <w:p>
+      <w:pPr>
+        <w:rPr>
+          <w:rFonts w:ascii="Times New Roman" w:hAnsi="Times New Roman" w:cs="Times New Roman"/>
+          <w:sz w:val="28"/>
+          <w:szCs w:val="28"/>
+        </w:rPr>
+      </w:pPr>
+      <w:r>
+        <w:rPr>
+          <w:rFonts w:ascii="Segoe UI Emoji" w:hAnsi="Segoe UI Emoji" w:cs="Segoe UI Emoji"/>
+          <w:sz w:val="28"/>
+          <w:szCs w:val="28"/>
+        </w:rPr>
+        <w:t>✅</w:t>
+      </w:r>
+      <w:r>
+        <w:rPr>
+          <w:rFonts w:ascii="Times New Roman" w:hAnsi="Times New Roman" w:cs="Times New Roman"/>
+          <w:sz w:val="28"/>
+          <w:szCs w:val="28"/>
+        </w:rPr>
+        <w:t xml:space="preserve"> JWT_SECRET=a3f5e8c91b2d4f67890123456789abcdef...</w:t>
+      </w:r>
+    </w:p>
+    <w:p>
+      <w:pPr>
+        <w:rPr>
+          <w:rFonts w:ascii="Times New Roman" w:hAnsi="Times New Roman" w:cs="Times New Roman"/>
+          <w:sz w:val="28"/>
+          <w:szCs w:val="28"/>
+        </w:rPr>
+      </w:pPr>
+      <w:r>
+        <w:rPr>
+          <w:rFonts w:ascii="Times New Roman" w:hAnsi="Times New Roman" w:cs="Times New Roman"/>
+          <w:sz w:val="28"/>
+          <w:szCs w:val="28"/>
+        </w:rPr>
+        <w:lastRenderedPageBreak/>
+        <w:t xml:space="preserve">   (long, random, unique string)</w:t>
+      </w:r>
+    </w:p>
+    <w:p>
+      <w:pPr>
+        <w:rPr>
+          <w:rFonts w:ascii="Times New Roman" w:hAnsi="Times New Roman" w:cs="Times New Roman"/>
+          <w:sz w:val="28"/>
+          <w:szCs w:val="28"/>
+        </w:rPr>
+      </w:pPr>
+    </w:p>
+    <w:p>
+      <w:pPr>
+        <w:rPr>
+          <w:rFonts w:ascii="Times New Roman" w:hAnsi="Times New Roman" w:cs="Times New Roman"/>
+          <w:sz w:val="28"/>
+          <w:szCs w:val="28"/>
+        </w:rPr>
+      </w:pPr>
+      <w:r>
+        <w:rPr>
+          <w:rFonts w:ascii="Times New Roman" w:hAnsi="Times New Roman" w:cs="Times New Roman"/>
+          <w:sz w:val="28"/>
+          <w:szCs w:val="28"/>
+        </w:rPr>
+        <w:t>Pitfall 2 — No Token Expiry</w:t>
+      </w:r>
+    </w:p>
+    <w:p>
+      <w:pPr>
+        <w:rPr>
+          <w:rFonts w:ascii="Times New Roman" w:hAnsi="Times New Roman" w:cs="Times New Roman"/>
+          <w:sz w:val="28"/>
+          <w:szCs w:val="28"/>
+        </w:rPr>
+      </w:pPr>
+      <w:r>
+        <w:rPr>
+          <w:rFonts w:ascii="Segoe UI Emoji" w:hAnsi="Segoe UI Emoji" w:cs="Segoe UI Emoji"/>
+          <w:sz w:val="28"/>
+          <w:szCs w:val="28"/>
+        </w:rPr>
+        <w:t>❌</w:t>
+      </w:r>
+      <w:r>
+        <w:rPr>
+          <w:rFonts w:ascii="Times New Roman" w:hAnsi="Times New Roman" w:cs="Times New Roman"/>
+          <w:sz w:val="28"/>
+          <w:szCs w:val="28"/>
+        </w:rPr>
+        <w:t xml:space="preserve"> jwt.sign({ id }, secret)  ← never expires!</w:t>
+      </w:r>
+    </w:p>
+    <w:p>
+      <w:pPr>
+        <w:rPr>
+          <w:rFonts w:ascii="Times New Roman" w:hAnsi="Times New Roman" w:cs="Times New Roman"/>
+          <w:sz w:val="28"/>
+          <w:szCs w:val="28"/>
+        </w:rPr>
+      </w:pPr>
+      <w:r>
+        <w:rPr>
+          <w:rFonts w:ascii="Segoe UI Emoji" w:hAnsi="Segoe UI Emoji" w:cs="Segoe UI Emoji"/>
+          <w:sz w:val="28"/>
+          <w:szCs w:val="28"/>
+        </w:rPr>
+        <w:t>✅</w:t>
+      </w:r>
+      <w:r>
+        <w:rPr>
+          <w:rFonts w:ascii="Times New Roman" w:hAnsi="Times New Roman" w:cs="Times New Roman"/>
+          <w:sz w:val="28"/>
+          <w:szCs w:val="28"/>
+        </w:rPr>
+        <w:t xml:space="preserve"> jwt.sign({ id }, secret, { expiresIn: '7d' })</w:t>
+      </w:r>
+    </w:p>
+    <w:p>
+      <w:pPr>
+        <w:rPr>
+          <w:rFonts w:ascii="Times New Roman" w:hAnsi="Times New Roman" w:cs="Times New Roman"/>
+          <w:sz w:val="28"/>
+          <w:szCs w:val="28"/>
+        </w:rPr>
+      </w:pPr>
+      <w:r>
+        <w:rPr>
+          <w:rFonts w:ascii="Times New Roman" w:hAnsi="Times New Roman" w:cs="Times New Roman"/>
+          <w:sz w:val="28"/>
+          <w:szCs w:val="28"/>
+        </w:rPr>
+        <w:t xml:space="preserve">   (token auto-expires after 7 days)</w:t>
+      </w:r>
+    </w:p>
+    <w:p>
+      <w:pPr>
+        <w:rPr>
+          <w:rFonts w:ascii="Times New Roman" w:hAnsi="Times New Roman" w:cs="Times New Roman"/>
+          <w:sz w:val="28"/>
+          <w:szCs w:val="28"/>
+        </w:rPr>
+      </w:pPr>
+    </w:p>
+    <w:p>
+      <w:pPr>
+        <w:rPr>
+          <w:rFonts w:ascii="Times New Roman" w:hAnsi="Times New Roman" w:cs="Times New Roman"/>
+          <w:sz w:val="28"/>
+          <w:szCs w:val="28"/>
+        </w:rPr>
+      </w:pPr>
+      <w:r>
+        <w:rPr>
+          <w:rFonts w:ascii="Times New Roman" w:hAnsi="Times New Roman" w:cs="Times New Roman"/>
+          <w:sz w:val="28"/>
+          <w:szCs w:val="28"/>
+        </w:rPr>
+        <w:t>Pitfall 3 — Storing Passwords in Plain Text</w:t>
+      </w:r>
+    </w:p>
+    <w:p>
+      <w:pPr>
+        <w:rPr>
+          <w:rFonts w:ascii="Times New Roman" w:hAnsi="Times New Roman" w:cs="Times New Roman"/>
+          <w:sz w:val="28"/>
+          <w:szCs w:val="28"/>
+        </w:rPr>
+      </w:pPr>
+      <w:r>
+        <w:rPr>
+          <w:rFonts w:ascii="Segoe UI Emoji" w:hAnsi="Segoe UI Emoji" w:cs="Segoe UI Emoji"/>
+          <w:sz w:val="28"/>
+          <w:szCs w:val="28"/>
+        </w:rPr>
+        <w:t>❌</w:t>
+      </w:r>
+      <w:r>
+        <w:rPr>
+          <w:rFonts w:ascii="Times New Roman" w:hAnsi="Times New Roman" w:cs="Times New Roman"/>
+          <w:sz w:val="28"/>
+          <w:szCs w:val="28"/>
+        </w:rPr>
+        <w:t xml:space="preserve"> password: "mypassword123"</w:t>
+      </w:r>
+    </w:p>
+    <w:p>
+      <w:pPr>
+        <w:rPr>
+          <w:rFonts w:ascii="Times New Roman" w:hAnsi="Times New Roman" w:cs="Times New Roman"/>
+          <w:sz w:val="28"/>
+          <w:szCs w:val="28"/>
+        </w:rPr>
+      </w:pPr>
+      <w:r>
+        <w:rPr>
+          <w:rFonts w:ascii="Segoe UI Emoji" w:hAnsi="Segoe UI Emoji" w:cs="Segoe UI Emoji"/>
+          <w:sz w:val="28"/>
+          <w:szCs w:val="28"/>
+        </w:rPr>
+        <w:t>✅</w:t>
+      </w:r>
+      <w:r>
+        <w:rPr>
+          <w:rFonts w:ascii="Times New Roman" w:hAnsi="Times New Roman" w:cs="Times New Roman"/>
+          <w:sz w:val="28"/>
+          <w:szCs w:val="28"/>
+        </w:rPr>
+        <w:t xml:space="preserve"> password: "$2a$10$N9qo8uLOickgx2ZMRZoMy..."</w:t>
+      </w:r>
+    </w:p>
+    <w:p>
+      <w:pPr>
+        <w:rPr>
+          <w:rFonts w:ascii="Times New Roman" w:hAnsi="Times New Roman" w:cs="Times New Roman"/>
+          <w:sz w:val="28"/>
+          <w:szCs w:val="28"/>
+        </w:rPr>
+      </w:pPr>
+      <w:r>
+        <w:rPr>
+          <w:rFonts w:ascii="Times New Roman" w:hAnsi="Times New Roman" w:cs="Times New Roman"/>
+          <w:sz w:val="28"/>
+          <w:szCs w:val="28"/>
+        </w:rPr>
+        <w:t xml:space="preserve">   (always hash with bcrypt!)</w:t>
+      </w:r>
+    </w:p>
+    <w:p>
+      <w:pPr>
+        <w:rPr>
+          <w:rFonts w:ascii="Times New Roman" w:hAnsi="Times New Roman" w:cs="Times New Roman"/>
+          <w:sz w:val="28"/>
+          <w:szCs w:val="28"/>
+        </w:rPr>
+      </w:pPr>
+    </w:p>
+    <w:p>
+      <w:pPr>
+        <w:rPr>
+          <w:rFonts w:ascii="Times New Roman" w:hAnsi="Times New Roman" w:cs="Times New Roman"/>
+          <w:sz w:val="28"/>
+          <w:szCs w:val="28"/>
+        </w:rPr>
+      </w:pPr>
+      <w:r>
+        <w:rPr>
+          <w:rFonts w:ascii="Times New Roman" w:hAnsi="Times New Roman" w:cs="Times New Roman"/>
+          <w:sz w:val="28"/>
+          <w:szCs w:val="28"/>
+        </w:rPr>
+        <w:t>Pitfall 4 — Exposing Sensitive Data</w:t>
+      </w:r>
+    </w:p>
+    <w:p>
+      <w:pPr>
+        <w:rPr>
+          <w:rFonts w:ascii="Times New Roman" w:hAnsi="Times New Roman" w:cs="Times New Roman"/>
+          <w:sz w:val="28"/>
+          <w:szCs w:val="28"/>
+        </w:rPr>
+      </w:pPr>
+      <w:r>
+        <w:rPr>
+          <w:rFonts w:ascii="Segoe UI Emoji" w:hAnsi="Segoe UI Emoji" w:cs="Segoe UI Emoji"/>
+          <w:sz w:val="28"/>
+          <w:szCs w:val="28"/>
+        </w:rPr>
+        <w:t>❌</w:t>
+      </w:r>
+      <w:r>
+        <w:rPr>
+          <w:rFonts w:ascii="Times New Roman" w:hAnsi="Times New Roman" w:cs="Times New Roman"/>
+          <w:sz w:val="28"/>
+          <w:szCs w:val="28"/>
+        </w:rPr>
+        <w:t xml:space="preserve"> Returning password in API response</w:t>
+      </w:r>
+    </w:p>
+    <w:p>
+      <w:pPr>
+        <w:rPr>
+          <w:rFonts w:ascii="Times New Roman" w:hAnsi="Times New Roman" w:cs="Times New Roman"/>
+          <w:sz w:val="28"/>
+          <w:szCs w:val="28"/>
+        </w:rPr>
+      </w:pPr>
+      <w:r>
+        <w:rPr>
+          <w:rFonts w:ascii="Segoe UI Emoji" w:hAnsi="Segoe UI Emoji" w:cs="Segoe UI Emoji"/>
+          <w:sz w:val="28"/>
+          <w:szCs w:val="28"/>
+        </w:rPr>
+        <w:t>✅</w:t>
+      </w:r>
+      <w:r>
+        <w:rPr>
+          <w:rFonts w:ascii="Times New Roman" w:hAnsi="Times New Roman" w:cs="Times New Roman"/>
+          <w:sz w:val="28"/>
+          <w:szCs w:val="28"/>
+        </w:rPr>
+        <w:t xml:space="preserve"> Using select: false in Mongoose schema</w:t>
+      </w:r>
+    </w:p>
+    <w:p>
+      <w:pPr>
+        <w:rPr>
+          <w:rFonts w:ascii="Times New Roman" w:hAnsi="Times New Roman" w:cs="Times New Roman"/>
+          <w:sz w:val="28"/>
+          <w:szCs w:val="28"/>
+        </w:rPr>
+      </w:pPr>
+      <w:r>
+        <w:rPr>
+          <w:rFonts w:ascii="Times New Roman" w:hAnsi="Times New Roman" w:cs="Times New Roman"/>
+          <w:sz w:val="28"/>
+          <w:szCs w:val="28"/>
+        </w:rPr>
+        <w:t xml:space="preserve">   password never included in responses</w:t>
+      </w:r>
+    </w:p>
+    <w:p>
+      <w:pPr>
+        <w:rPr>
+          <w:rFonts w:ascii="Times New Roman" w:hAnsi="Times New Roman" w:cs="Times New Roman"/>
+          <w:sz w:val="28"/>
+          <w:szCs w:val="28"/>
+        </w:rPr>
+      </w:pPr>
+    </w:p>
+    <w:p>
+      <w:pPr>
+        <w:rPr>
+          <w:rFonts w:ascii="Times New Roman" w:hAnsi="Times New Roman" w:cs="Times New Roman"/>
+          <w:sz w:val="28"/>
+          <w:szCs w:val="28"/>
+        </w:rPr>
+      </w:pPr>
+      <w:r>
+        <w:rPr>
+          <w:rFonts w:ascii="Times New Roman" w:hAnsi="Times New Roman" w:cs="Times New Roman"/>
+          <w:sz w:val="28"/>
+          <w:szCs w:val="28"/>
+        </w:rPr>
+        <w:t>Pitfall 5 — No CORS Protection</w:t>
+      </w:r>
+    </w:p>
+    <w:p>
+      <w:pPr>
+        <w:rPr>
+          <w:rFonts w:ascii="Times New Roman" w:hAnsi="Times New Roman" w:cs="Times New Roman"/>
+          <w:sz w:val="28"/>
+          <w:szCs w:val="28"/>
+        </w:rPr>
+      </w:pPr>
+      <w:r>
+        <w:rPr>
+          <w:rFonts w:ascii="Segoe UI Emoji" w:hAnsi="Segoe UI Emoji" w:cs="Segoe UI Emoji"/>
+          <w:sz w:val="28"/>
+          <w:szCs w:val="28"/>
+        </w:rPr>
+        <w:t>❌</w:t>
+      </w:r>
+      <w:r>
+        <w:rPr>
+          <w:rFonts w:ascii="Times New Roman" w:hAnsi="Times New Roman" w:cs="Times New Roman"/>
+          <w:sz w:val="28"/>
+          <w:szCs w:val="28"/>
+        </w:rPr>
+        <w:t xml:space="preserve"> app.use(cors())   ← allows ALL origins</w:t>
+      </w:r>
+    </w:p>
+    <w:p>
+      <w:pPr>
+        <w:rPr>
+          <w:rFonts w:ascii="Times New Roman" w:hAnsi="Times New Roman" w:cs="Times New Roman"/>
+          <w:sz w:val="28"/>
+          <w:szCs w:val="28"/>
+        </w:rPr>
+      </w:pPr>
+      <w:r>
+        <w:rPr>
+          <w:rFonts w:ascii="Segoe UI Emoji" w:hAnsi="Segoe UI Emoji" w:cs="Segoe UI Emoji"/>
+          <w:sz w:val="28"/>
+          <w:szCs w:val="28"/>
+        </w:rPr>
+        <w:t>✅</w:t>
+      </w:r>
+      <w:r>
+        <w:rPr>
+          <w:rFonts w:ascii="Times New Roman" w:hAnsi="Times New Roman" w:cs="Times New Roman"/>
+          <w:sz w:val="28"/>
+          <w:szCs w:val="28"/>
+        </w:rPr>
+        <w:t xml:space="preserve"> app.use(cors({    ← only allow your frontend</w:t>
+      </w:r>
+    </w:p>
+    <w:p>
+      <w:pPr>
+        <w:rPr>
+          <w:rFonts w:ascii="Times New Roman" w:hAnsi="Times New Roman" w:cs="Times New Roman"/>
+          <w:sz w:val="28"/>
+          <w:szCs w:val="28"/>
+        </w:rPr>
+      </w:pPr>
+      <w:r>
+        <w:rPr>
+          <w:rFonts w:ascii="Times New Roman" w:hAnsi="Times New Roman" w:cs="Times New Roman"/>
+          <w:sz w:val="28"/>
+          <w:szCs w:val="28"/>
+        </w:rPr>
+        <w:t xml:space="preserve">     origin: 'http://localhost:3000'</w:t>
+      </w:r>
+    </w:p>
+    <w:p>
+      <w:pPr>
+        <w:rPr>
+          <w:rFonts w:ascii="Times New Roman" w:hAnsi="Times New Roman" w:cs="Times New Roman"/>
+          <w:sz w:val="28"/>
+          <w:szCs w:val="28"/>
+        </w:rPr>
+      </w:pPr>
+      <w:r>
+        <w:rPr>
+          <w:rFonts w:ascii="Times New Roman" w:hAnsi="Times New Roman" w:cs="Times New Roman"/>
+          <w:sz w:val="28"/>
+          <w:szCs w:val="28"/>
+        </w:rPr>
+        <w:t xml:space="preserve">   }))</w:t>
+      </w:r>
+    </w:p>
+    <w:p>
+      <w:pPr>
+        <w:rPr>
+          <w:rFonts w:ascii="Times New Roman" w:hAnsi="Times New Roman" w:cs="Times New Roman"/>
+          <w:sz w:val="28"/>
+          <w:szCs w:val="28"/>
+        </w:rPr>
+      </w:pPr>
+      <w:r>
+        <w:rPr>
+          <w:rFonts w:ascii="Times New Roman" w:hAnsi="Times New Roman" w:cs="Times New Roman"/>
+          <w:sz w:val="28"/>
+          <w:szCs w:val="28"/>
+        </w:rPr>
+        <w:pict w14:anchorId="2C92096A">
+          <v:rect id="_x0000_i1464" style="width:0;height:1.5pt" o:hralign="center" o:hrstd="t" o:hr="t" fillcolor="#a0a0a0" stroked="f"/>
+        </w:pict>
+      </w:r>
+    </w:p>
+    <w:p>
+      <w:pPr>
+        <w:rPr>
+          <w:rFonts w:ascii="Times New Roman" w:hAnsi="Times New Roman" w:cs="Times New Roman"/>
+          <w:b/>
+          <w:bCs/>
+          <w:sz w:val="28"/>
+          <w:szCs w:val="28"/>
+        </w:rPr>
+      </w:pPr>
+      <w:r>
+        <w:rPr>
+          <w:rFonts w:ascii="Times New Roman" w:hAnsi="Times New Roman" w:cs="Times New Roman"/>
+          <w:b/>
+          <w:bCs/>
+          <w:sz w:val="28"/>
+          <w:szCs w:val="28"/>
+        </w:rPr>
+        <w:t>3. JWT Token Lifecycle</w:t>
+      </w:r>
+    </w:p>
+    <w:p>
+      <w:pPr>
+        <w:rPr>
+          <w:rFonts w:ascii="Times New Roman" w:hAnsi="Times New Roman" w:cs="Times New Roman"/>
+          <w:sz w:val="28"/>
+          <w:szCs w:val="28"/>
+        </w:rPr>
+      </w:pPr>
+      <w:r>
+        <w:rPr>
+          <w:rFonts w:ascii="Times New Roman" w:hAnsi="Times New Roman" w:cs="Times New Roman"/>
+          <w:sz w:val="28"/>
+          <w:szCs w:val="28"/>
+        </w:rPr>
+        <w:t>1. User logs in with email + password</w:t>
+      </w:r>
+    </w:p>
+    <w:p>
+      <w:pPr>
+        <w:rPr>
+          <w:rFonts w:ascii="Times New Roman" w:hAnsi="Times New Roman" w:cs="Times New Roman"/>
+          <w:sz w:val="28"/>
+          <w:szCs w:val="28"/>
+        </w:rPr>
+      </w:pPr>
+      <w:r>
+        <w:rPr>
+          <w:rFonts w:ascii="Times New Roman" w:hAnsi="Times New Roman" w:cs="Times New Roman"/>
+          <w:sz w:val="28"/>
+          <w:szCs w:val="28"/>
+        </w:rPr>
+        <w:lastRenderedPageBreak/>
+        <w:t>2. Server verifies credentials</w:t>
+      </w:r>
+    </w:p>
+    <w:p>
+      <w:pPr>
+        <w:rPr>
+          <w:rFonts w:ascii="Times New Roman" w:hAnsi="Times New Roman" w:cs="Times New Roman"/>
+          <w:sz w:val="28"/>
+          <w:szCs w:val="28"/>
+        </w:rPr>
+      </w:pPr>
+      <w:r>
+        <w:rPr>
+          <w:rFonts w:ascii="Times New Roman" w:hAnsi="Times New Roman" w:cs="Times New Roman"/>
+          <w:sz w:val="28"/>
+          <w:szCs w:val="28"/>
+        </w:rPr>
+        <w:t>3. Server creates JWT with user ID inside</w:t>
+      </w:r>
+    </w:p>
+    <w:p>
+      <w:pPr>
+        <w:rPr>
+          <w:rFonts w:ascii="Times New Roman" w:hAnsi="Times New Roman" w:cs="Times New Roman"/>
+          <w:sz w:val="28"/>
+          <w:szCs w:val="28"/>
+        </w:rPr>
+      </w:pPr>
+      <w:r>
+        <w:rPr>
+          <w:rFonts w:ascii="Times New Roman" w:hAnsi="Times New Roman" w:cs="Times New Roman"/>
+          <w:sz w:val="28"/>
+          <w:szCs w:val="28"/>
+        </w:rPr>
+        <w:t>4. Token sent to client</w:t>
+      </w:r>
+    </w:p>
+    <w:p>
+      <w:pPr>
+        <w:rPr>
+          <w:rFonts w:ascii="Times New Roman" w:hAnsi="Times New Roman" w:cs="Times New Roman"/>
+          <w:sz w:val="28"/>
+          <w:szCs w:val="28"/>
+        </w:rPr>
+      </w:pPr>
+      <w:r>
+        <w:rPr>
+          <w:rFonts w:ascii="Times New Roman" w:hAnsi="Times New Roman" w:cs="Times New Roman"/>
+          <w:sz w:val="28"/>
+          <w:szCs w:val="28"/>
+        </w:rPr>
+        <w:t>5. Client stores token (localStorage)</w:t>
+      </w:r>
+    </w:p>
+    <w:p>
+      <w:pPr>
+        <w:rPr>
+          <w:rFonts w:ascii="Times New Roman" w:hAnsi="Times New Roman" w:cs="Times New Roman"/>
+          <w:sz w:val="28"/>
+          <w:szCs w:val="28"/>
+        </w:rPr>
+      </w:pPr>
+      <w:r>
+        <w:rPr>
+          <w:rFonts w:ascii="Times New Roman" w:hAnsi="Times New Roman" w:cs="Times New Roman"/>
+          <w:sz w:val="28"/>
+          <w:szCs w:val="28"/>
+        </w:rPr>
+        <w:t>6. Client sends token with every protected request</w:t>
+      </w:r>
+    </w:p>
+    <w:p>
+      <w:pPr>
+        <w:rPr>
+          <w:rFonts w:ascii="Times New Roman" w:hAnsi="Times New Roman" w:cs="Times New Roman"/>
+          <w:sz w:val="28"/>
+          <w:szCs w:val="28"/>
+        </w:rPr>
+      </w:pPr>
+      <w:r>
+        <w:rPr>
+          <w:rFonts w:ascii="Times New Roman" w:hAnsi="Times New Roman" w:cs="Times New Roman"/>
+          <w:sz w:val="28"/>
+          <w:szCs w:val="28"/>
+        </w:rPr>
+        <w:t>7. Server verifies token on each request</w:t>
+      </w:r>
+    </w:p>
+    <w:p>
+      <w:pPr>
+        <w:rPr>
+          <w:rFonts w:ascii="Times New Roman" w:hAnsi="Times New Roman" w:cs="Times New Roman"/>
+          <w:sz w:val="28"/>
+          <w:szCs w:val="28"/>
+        </w:rPr>
+      </w:pPr>
+      <w:r>
+        <w:rPr>
+          <w:rFonts w:ascii="Times New Roman" w:hAnsi="Times New Roman" w:cs="Times New Roman"/>
+          <w:sz w:val="28"/>
+          <w:szCs w:val="28"/>
+        </w:rPr>
+        <w:t>8. Token expires after 7 days → user must login again</w:t>
+      </w:r>
+    </w:p>
+    <w:p>
+      <w:pPr>
+        <w:rPr>
+          <w:rFonts w:ascii="Times New Roman" w:hAnsi="Times New Roman" w:cs="Times New Roman"/>
+          <w:sz w:val="28"/>
+          <w:szCs w:val="28"/>
+        </w:rPr>
+      </w:pPr>
+      <w:r>
+        <w:rPr>
+          <w:rFonts w:ascii="Times New Roman" w:hAnsi="Times New Roman" w:cs="Times New Roman"/>
+          <w:sz w:val="28"/>
+          <w:szCs w:val="28"/>
+        </w:rPr>
+        <w:pict w14:anchorId="38DC986B">
+          <v:rect id="_x0000_i1473" style="width:0;height:1.5pt" o:hralign="center" o:hrstd="t" o:hr="t" fillcolor="#a0a0a0" stroked="f"/>
+        </w:pict>
+      </w:r>
+    </w:p>
+    <w:p>
+      <w:pPr>
+        <w:rPr>
+          <w:rFonts w:ascii="Times New Roman" w:hAnsi="Times New Roman" w:cs="Times New Roman"/>
+          <w:b/>
+          <w:bCs/>
+          <w:sz w:val="28"/>
+          <w:szCs w:val="28"/>
+        </w:rPr>
+      </w:pPr>
+      <w:r>
+        <w:rPr>
+          <w:rFonts w:ascii="Times New Roman" w:hAnsi="Times New Roman" w:cs="Times New Roman"/>
+          <w:b/>
+          <w:bCs/>
+          <w:sz w:val="28"/>
+          <w:szCs w:val="28"/>
+        </w:rPr>
+        <w:t>4. What Happens if Token is Stolen?</w:t>
+      </w:r>
+    </w:p>
+    <w:p>
+      <w:pPr>
+        <w:rPr>
+          <w:rFonts w:ascii="Times New Roman" w:hAnsi="Times New Roman" w:cs="Times New Roman"/>
+          <w:sz w:val="28"/>
+          <w:szCs w:val="28"/>
+        </w:rPr>
+      </w:pPr>
+      <w:r>
+        <w:rPr>
+          <w:rFonts w:ascii="Times New Roman" w:hAnsi="Times New Roman" w:cs="Times New Roman"/>
+          <w:sz w:val="28"/>
+          <w:szCs w:val="28"/>
+        </w:rPr>
+        <w:t>If someone steals your JWT token:</w:t>
+      </w:r>
+    </w:p>
+    <w:p>
+      <w:pPr>
+        <w:rPr>
+          <w:rFonts w:ascii="Times New Roman" w:hAnsi="Times New Roman" w:cs="Times New Roman"/>
+          <w:sz w:val="28"/>
+          <w:szCs w:val="28"/>
+        </w:rPr>
+      </w:pPr>
+      <w:r>
+        <w:rPr>
+          <w:rFonts w:ascii="Times New Roman" w:hAnsi="Times New Roman" w:cs="Times New Roman"/>
+          <w:sz w:val="28"/>
+          <w:szCs w:val="28"/>
+        </w:rPr>
+        <w:t>→ They can act as you until it expires</w:t>
+      </w:r>
+    </w:p>
+    <w:p>
+      <w:pPr>
+        <w:rPr>
+          <w:rFonts w:ascii="Times New Roman" w:hAnsi="Times New Roman" w:cs="Times New Roman"/>
+          <w:sz w:val="28"/>
+          <w:szCs w:val="28"/>
+        </w:rPr>
+      </w:pPr>
+      <w:r>
+        <w:rPr>
+          <w:rFonts w:ascii="Times New Roman" w:hAnsi="Times New Roman" w:cs="Times New Roman"/>
+          <w:sz w:val="28"/>
+          <w:szCs w:val="28"/>
+        </w:rPr>
+        <w:t>→ That's why short expiry times matter!</w:t>
+      </w:r>
+    </w:p>
+    <w:p>
+      <w:pPr>
+        <w:rPr>
+          <w:rFonts w:ascii="Times New Roman" w:hAnsi="Times New Roman" w:cs="Times New Roman"/>
+          <w:sz w:val="28"/>
+          <w:szCs w:val="28"/>
+        </w:rPr>
+      </w:pPr>
+    </w:p>
+    <w:p>
+      <w:pPr>
+        <w:rPr>
+          <w:rFonts w:ascii="Times New Roman" w:hAnsi="Times New Roman" w:cs="Times New Roman"/>
+          <w:sz w:val="28"/>
+          <w:szCs w:val="28"/>
+        </w:rPr>
+      </w:pPr>
+      <w:r>
+        <w:rPr>
+          <w:rFonts w:ascii="Times New Roman" w:hAnsi="Times New Roman" w:cs="Times New Roman"/>
+          <w:sz w:val="28"/>
+          <w:szCs w:val="28"/>
+        </w:rPr>
+        <w:t>Protection measures:</w:t>
+      </w:r>
+    </w:p>
+    <w:p>
+      <w:pPr>
+        <w:rPr>
+          <w:rFonts w:ascii="Times New Roman" w:hAnsi="Times New Roman" w:cs="Times New Roman"/>
+          <w:sz w:val="28"/>
+          <w:szCs w:val="28"/>
+        </w:rPr>
+      </w:pPr>
+      <w:r>
+        <w:rPr>
+          <w:rFonts w:ascii="Segoe UI Emoji" w:hAnsi="Segoe UI Emoji" w:cs="Segoe UI Emoji"/>
+          <w:sz w:val="28"/>
+          <w:szCs w:val="28"/>
+        </w:rPr>
+        <w:t>✅</w:t>
+      </w:r>
+      <w:r>
+        <w:rPr>
+          <w:rFonts w:ascii="Times New Roman" w:hAnsi="Times New Roman" w:cs="Times New Roman"/>
+          <w:sz w:val="28"/>
+          <w:szCs w:val="28"/>
+        </w:rPr>
+        <w:t xml:space="preserve"> Short token expiry (7d or less)</w:t>
+      </w:r>
+    </w:p>
+    <w:p>
+      <w:pPr>
+        <w:rPr>
+          <w:rFonts w:ascii="Times New Roman" w:hAnsi="Times New Roman" w:cs="Times New Roman"/>
+          <w:sz w:val="28"/>
+          <w:szCs w:val="28"/>
+        </w:rPr>
+      </w:pPr>
+      <w:r>
+        <w:rPr>
+          <w:rFonts w:ascii="Segoe UI Emoji" w:hAnsi="Segoe UI Emoji" w:cs="Segoe UI Emoji"/>
+          <w:sz w:val="28"/>
+          <w:szCs w:val="28"/>
+        </w:rPr>
+        <w:t>✅</w:t>
+      </w:r>
+      <w:r>
+        <w:rPr>
+          <w:rFonts w:ascii="Times New Roman" w:hAnsi="Times New Roman" w:cs="Times New Roman"/>
+          <w:sz w:val="28"/>
+          <w:szCs w:val="28"/>
+        </w:rPr>
+        <w:t xml:space="preserve"> HTTPS in production (encrypts data in transit)</w:t>
+      </w:r>
+    </w:p>
+    <w:p>
+      <w:pPr>
+        <w:rPr>
+          <w:rFonts w:ascii="Times New Roman" w:hAnsi="Times New Roman" w:cs="Times New Roman"/>
+          <w:sz w:val="28"/>
+          <w:szCs w:val="28"/>
+        </w:rPr>
+      </w:pPr>
+      <w:r>
+        <w:rPr>
+          <w:rFonts w:ascii="Segoe UI Emoji" w:hAnsi="Segoe UI Emoji" w:cs="Segoe UI Emoji"/>
+          <w:sz w:val="28"/>
+          <w:szCs w:val="28"/>
+        </w:rPr>
+        <w:t>✅</w:t>
+      </w:r>
+      <w:r>
+        <w:rPr>
+          <w:rFonts w:ascii="Times New Roman" w:hAnsi="Times New Roman" w:cs="Times New Roman"/>
+          <w:sz w:val="28"/>
+          <w:szCs w:val="28"/>
+        </w:rPr>
+        <w:t xml:space="preserve"> httpOnly cookies (prevents JS access)</w:t>
+      </w:r>
+    </w:p>
+    <w:p>
+      <w:pPr>
+        <w:rPr>
+          <w:rFonts w:ascii="Times New Roman" w:hAnsi="Times New Roman" w:cs="Times New Roman"/>
+          <w:sz w:val="28"/>
+          <w:szCs w:val="28"/>
+        </w:rPr>
+      </w:pPr>
+      <w:r>
+        <w:rPr>
+          <w:rFonts w:ascii="Segoe UI Emoji" w:hAnsi="Segoe UI Emoji" w:cs="Segoe UI Emoji"/>
+          <w:sz w:val="28"/>
+          <w:szCs w:val="28"/>
+        </w:rPr>
+        <w:t>✅</w:t>
+      </w:r>
+      <w:r>
+        <w:rPr>
+          <w:rFonts w:ascii="Times New Roman" w:hAnsi="Times New Roman" w:cs="Times New Roman"/>
+          <w:sz w:val="28"/>
+          <w:szCs w:val="28"/>
+        </w:rPr>
+        <w:t xml:space="preserve"> Refresh token rotation (advanced)</w:t>
+      </w:r>
+    </w:p>
+    <w:p>
+      <w:pPr>
+        <w:rPr>
+          <w:rFonts w:ascii="Times New Roman" w:hAnsi="Times New Roman" w:cs="Times New Roman"/>
+          <w:sz w:val="28"/>
+          <w:szCs w:val="28"/>
+        </w:rPr>
+      </w:pPr>
+      <w:r>
+        <w:rPr>
+          <w:rFonts w:ascii="Times New Roman" w:hAnsi="Times New Roman" w:cs="Times New Roman"/>
+          <w:sz w:val="28"/>
+          <w:szCs w:val="28"/>
+        </w:rPr>
+        <w:pict w14:anchorId="66634855">
+          <v:rect id="_x0000_i1476" style="width:0;height:1.5pt" o:hralign="center" o:hrstd="t" o:hr="t" fillcolor="#a0a0a0" stroked="f"/>
+        </w:pict>
+      </w:r>
+    </w:p>
+    <w:p>
+      <w:pPr>
+        <w:rPr>
+          <w:rFonts w:ascii="Times New Roman" w:hAnsi="Times New Roman" w:cs="Times New Roman"/>
+          <w:b/>
+          <w:bCs/>
+          <w:sz w:val="28"/>
+          <w:szCs w:val="28"/>
+        </w:rPr>
+      </w:pPr>
+      <w:r>
+        <w:rPr>
+          <w:rFonts w:ascii="Times New Roman" w:hAnsi="Times New Roman" w:cs="Times New Roman"/>
+          <w:b/>
+          <w:bCs/>
+          <w:sz w:val="28"/>
+          <w:szCs w:val="28"/>
+        </w:rPr>
+        <w:t>Step 6 — Security Notes + Deployment</w:t>
+      </w:r>
+    </w:p>
+    <w:p>
+      <w:pPr>
+        <w:rPr>
+          <w:rFonts w:ascii="Times New Roman" w:hAnsi="Times New Roman" w:cs="Times New Roman"/>
+          <w:sz w:val="28"/>
+          <w:szCs w:val="28"/>
+        </w:rPr>
+      </w:pPr>
+      <w:r>
+        <w:rPr>
+          <w:rFonts w:ascii="Times New Roman" w:hAnsi="Times New Roman" w:cs="Times New Roman"/>
+          <w:b/>
+          <w:bCs/>
+          <w:sz w:val="28"/>
+          <w:szCs w:val="28"/>
+        </w:rPr>
+        <w:t>Token Storage Decision:</w:t>
+      </w:r>
+      <w:r>
+        <w:rPr>
+          <w:rFonts w:ascii="Times New Roman" w:hAnsi="Times New Roman" w:cs="Times New Roman"/>
+          <w:sz w:val="28"/>
+          <w:szCs w:val="28"/>
+        </w:rPr>
+        <w:br/>
+        <w:t>Used localStorage for simplicity in this learning project.</w:t>
+      </w:r>
+      <w:r>
+        <w:rPr>
+          <w:rFonts w:ascii="Times New Roman" w:hAnsi="Times New Roman" w:cs="Times New Roman"/>
+          <w:sz w:val="28"/>
+          <w:szCs w:val="28"/>
+        </w:rPr>
+        <w:br/>
+        <w:t>Production apps should use httpOnly cookies for better security.</w:t>
+      </w:r>
+    </w:p>
+    <w:p>
+      <w:pPr>
+        <w:rPr>
+          <w:rFonts w:ascii="Times New Roman" w:hAnsi="Times New Roman" w:cs="Times New Roman"/>
+          <w:sz w:val="28"/>
+          <w:szCs w:val="28"/>
+        </w:rPr>
+      </w:pPr>
+      <w:r>
+        <w:rPr>
+          <w:rFonts w:ascii="Times New Roman" w:hAnsi="Times New Roman" w:cs="Times New Roman"/>
+          <w:b/>
+          <w:bCs/>
+          <w:sz w:val="28"/>
+          <w:szCs w:val="28"/>
+        </w:rPr>
+        <w:t>Key Security Implementations:</w:t>
+      </w:r>
+    </w:p>
+    <w:p>
+      <w:pPr>
+        <w:numPr>
+          <w:ilvl w:val="0"/>
+          <w:numId w:val="6"/>
+        </w:numPr>
+        <w:rPr>
+          <w:rFonts w:ascii="Times New Roman" w:hAnsi="Times New Roman" w:cs="Times New Roman"/>
+          <w:sz w:val="28"/>
+          <w:szCs w:val="28"/>
+        </w:rPr>
+      </w:pPr>
+      <w:r>
+        <w:rPr>
+          <w:rFonts w:ascii="Times New Roman" w:hAnsi="Times New Roman" w:cs="Times New Roman"/>
+          <w:sz w:val="28"/>
+          <w:szCs w:val="28"/>
+        </w:rPr>
+        <w:t>bcrypt password hashing (salt rounds: 10)</w:t>
+      </w:r>
+    </w:p>
+    <w:p>
+      <w:pPr>
+        <w:numPr>
+          <w:ilvl w:val="0"/>
+          <w:numId w:val="6"/>
+        </w:numPr>
+        <w:rPr>
+          <w:rFonts w:ascii="Times New Roman" w:hAnsi="Times New Roman" w:cs="Times New Roman"/>
+          <w:sz w:val="28"/>
+          <w:szCs w:val="28"/>
+        </w:rPr>
+      </w:pPr>
+      <w:r>
+        <w:rPr>
+          <w:rFonts w:ascii="Times New Roman" w:hAnsi="Times New Roman" w:cs="Times New Roman"/>
+          <w:sz w:val="28"/>
+          <w:szCs w:val="28"/>
+        </w:rPr>
+        <w:t>JWT with 7-day expiration</w:t>
+      </w:r>
+    </w:p>
+    <w:p>
+      <w:pPr>
+        <w:numPr>
+          <w:ilvl w:val="0"/>
+          <w:numId w:val="6"/>
+        </w:numPr>
+        <w:rPr>
+          <w:rFonts w:ascii="Times New Roman" w:hAnsi="Times New Roman" w:cs="Times New Roman"/>
+          <w:sz w:val="28"/>
+          <w:szCs w:val="28"/>
+        </w:rPr>
+      </w:pPr>
+      <w:r>
+        <w:rPr>
+          <w:rFonts w:ascii="Times New Roman" w:hAnsi="Times New Roman" w:cs="Times New Roman"/>
+          <w:sz w:val="28"/>
+          <w:szCs w:val="28"/>
+        </w:rPr>
+        <w:lastRenderedPageBreak/>
+        <w:t>Protected API routes using middleware</w:t>
+      </w:r>
+    </w:p>
+    <w:p>
+      <w:pPr>
+        <w:numPr>
+          <w:ilvl w:val="0"/>
+          <w:numId w:val="6"/>
+        </w:numPr>
+        <w:rPr>
+          <w:rFonts w:ascii="Times New Roman" w:hAnsi="Times New Roman" w:cs="Times New Roman"/>
+          <w:sz w:val="28"/>
+          <w:szCs w:val="28"/>
+        </w:rPr>
+      </w:pPr>
+      <w:r>
+        <w:rPr>
+          <w:rFonts w:ascii="Times New Roman" w:hAnsi="Times New Roman" w:cs="Times New Roman"/>
+          <w:sz w:val="28"/>
+          <w:szCs w:val="28"/>
+        </w:rPr>
+        <w:t>Password field excluded from all responses (select: false)</w:t>
+      </w:r>
+    </w:p>
+    <w:p>
+      <w:pPr>
+        <w:numPr>
+          <w:ilvl w:val="0"/>
+          <w:numId w:val="6"/>
+        </w:numPr>
+        <w:rPr>
+          <w:rFonts w:ascii="Times New Roman" w:hAnsi="Times New Roman" w:cs="Times New Roman"/>
+          <w:sz w:val="28"/>
+          <w:szCs w:val="28"/>
+        </w:rPr>
+      </w:pPr>
+      <w:r>
+        <w:rPr>
+          <w:rFonts w:ascii="Times New Roman" w:hAnsi="Times New Roman" w:cs="Times New Roman"/>
+          <w:sz w:val="28"/>
+          <w:szCs w:val="28"/>
+        </w:rPr>
+        <w:t>Frontend protected routes redirect unauthenticated users</w:t>
+      </w:r>
+    </w:p>
+    <w:p>
+      <w:pPr>
+        <w:rPr>
+          <w:rFonts w:ascii="Times New Roman" w:hAnsi="Times New Roman" w:cs="Times New Roman"/>
+          <w:sz w:val="28"/>
+          <w:szCs w:val="28"/>
+        </w:rPr>
+      </w:pPr>
+    </w:p>
+    <w:p>
+      <w:pPr>
+        <w:rPr>
+          <w:rFonts w:ascii="Times New Roman" w:hAnsi="Times New Roman" w:cs="Times New Roman"/>
+          <w:sz w:val="28"/>
+          <w:szCs w:val="28"/>
+        </w:rPr>
+      </w:pPr>
     </w:p>
     <w:sectPr>
       <w:pgSz w:w="11906" w:h="16838"/>
@@ -3853,9 +5440,307 @@
     </w:lvl>
   </w:abstractNum>
   <w:abstractNum w:abstractNumId="3" w15:restartNumberingAfterBreak="0">
+    <w:nsid w:val="2F62031C"/>
+    <w:multiLevelType w:val="multilevel"/>
+    <w:tmpl w:val="CFD254AE"/>
+    <w:lvl w:ilvl="0">
+      <w:start w:val="1"/>
+      <w:numFmt w:val="bullet"/>
+      <w:lvlText w:val=""/>
+      <w:lvlJc w:val="left"/>
+      <w:pPr>
+        <w:tabs>
+          <w:tab w:val="num" w:pos="720"/>
+        </w:tabs>
+        <w:ind w:left="720" w:hanging="360"/>
+      </w:pPr>
+      <w:rPr>
+        <w:rFonts w:ascii="Symbol" w:hAnsi="Symbol" w:hint="default"/>
+        <w:sz w:val="20"/>
+      </w:rPr>
+    </w:lvl>
+    <w:lvl w:ilvl="1" w:tentative="1">
+      <w:start w:val="1"/>
+      <w:numFmt w:val="bullet"/>
+      <w:lvlText w:val="o"/>
+      <w:lvlJc w:val="left"/>
+      <w:pPr>
+        <w:tabs>
+          <w:tab w:val="num" w:pos="1440"/>
+        </w:tabs>
+        <w:ind w:left="1440" w:hanging="360"/>
+      </w:pPr>
+      <w:rPr>
+        <w:rFonts w:ascii="Courier New" w:hAnsi="Courier New" w:hint="default"/>
+        <w:sz w:val="20"/>
+      </w:rPr>
+    </w:lvl>
+    <w:lvl w:ilvl="2" w:tentative="1">
+      <w:start w:val="1"/>
+      <w:numFmt w:val="bullet"/>
+      <w:lvlText w:val=""/>
+      <w:lvlJc w:val="left"/>
+      <w:pPr>
+        <w:tabs>
+          <w:tab w:val="num" w:pos="2160"/>
+        </w:tabs>
+        <w:ind w:left="2160" w:hanging="360"/>
+      </w:pPr>
+      <w:rPr>
+        <w:rFonts w:ascii="Wingdings" w:hAnsi="Wingdings" w:hint="default"/>
+        <w:sz w:val="20"/>
+      </w:rPr>
+    </w:lvl>
+    <w:lvl w:ilvl="3" w:tentative="1">
+      <w:start w:val="1"/>
+      <w:numFmt w:val="bullet"/>
+      <w:lvlText w:val=""/>
+      <w:lvlJc w:val="left"/>
+      <w:pPr>
+        <w:tabs>
+          <w:tab w:val="num" w:pos="2880"/>
+        </w:tabs>
+        <w:ind w:left="2880" w:hanging="360"/>
+      </w:pPr>
+      <w:rPr>
+        <w:rFonts w:ascii="Wingdings" w:hAnsi="Wingdings" w:hint="default"/>
+        <w:sz w:val="20"/>
+      </w:rPr>
+    </w:lvl>
+    <w:lvl w:ilvl="4" w:tentative="1">
+      <w:start w:val="1"/>
+      <w:numFmt w:val="bullet"/>
+      <w:lvlText w:val=""/>
+      <w:lvlJc w:val="left"/>
+      <w:pPr>
+        <w:tabs>
+          <w:tab w:val="num" w:pos="3600"/>
+        </w:tabs>
+        <w:ind w:left="3600" w:hanging="360"/>
+      </w:pPr>
+      <w:rPr>
+        <w:rFonts w:ascii="Wingdings" w:hAnsi="Wingdings" w:hint="default"/>
+        <w:sz w:val="20"/>
+      </w:rPr>
+    </w:lvl>
+    <w:lvl w:ilvl="5" w:tentative="1">
+      <w:start w:val="1"/>
+      <w:numFmt w:val="bullet"/>
+      <w:lvlText w:val=""/>
+      <w:lvlJc w:val="left"/>
+      <w:pPr>
+        <w:tabs>
+          <w:tab w:val="num" w:pos="4320"/>
+        </w:tabs>
+        <w:ind w:left="4320" w:hanging="360"/>
+      </w:pPr>
+      <w:rPr>
+        <w:rFonts w:ascii="Wingdings" w:hAnsi="Wingdings" w:hint="default"/>
+        <w:sz w:val="20"/>
+      </w:rPr>
+    </w:lvl>
+    <w:lvl w:ilvl="6" w:tentative="1">
+      <w:start w:val="1"/>
+      <w:numFmt w:val="bullet"/>
+      <w:lvlText w:val=""/>
+      <w:lvlJc w:val="left"/>
+      <w:pPr>
+        <w:tabs>
+          <w:tab w:val="num" w:pos="5040"/>
+        </w:tabs>
+        <w:ind w:left="5040" w:hanging="360"/>
+      </w:pPr>
+      <w:rPr>
+        <w:rFonts w:ascii="Wingdings" w:hAnsi="Wingdings" w:hint="default"/>
+        <w:sz w:val="20"/>
+      </w:rPr>
+    </w:lvl>
+    <w:lvl w:ilvl="7" w:tentative="1">
+      <w:start w:val="1"/>
+      <w:numFmt w:val="bullet"/>
+      <w:lvlText w:val=""/>
+      <w:lvlJc w:val="left"/>
+      <w:pPr>
+        <w:tabs>
+          <w:tab w:val="num" w:pos="5760"/>
+        </w:tabs>
+        <w:ind w:left="5760" w:hanging="360"/>
+      </w:pPr>
+      <w:rPr>
+        <w:rFonts w:ascii="Wingdings" w:hAnsi="Wingdings" w:hint="default"/>
+        <w:sz w:val="20"/>
+      </w:rPr>
+    </w:lvl>
+    <w:lvl w:ilvl="8" w:tentative="1">
+      <w:start w:val="1"/>
+      <w:numFmt w:val="bullet"/>
+      <w:lvlText w:val=""/>
+      <w:lvlJc w:val="left"/>
+      <w:pPr>
+        <w:tabs>
+          <w:tab w:val="num" w:pos="6480"/>
+        </w:tabs>
+        <w:ind w:left="6480" w:hanging="360"/>
+      </w:pPr>
+      <w:rPr>
+        <w:rFonts w:ascii="Wingdings" w:hAnsi="Wingdings" w:hint="default"/>
+        <w:sz w:val="20"/>
+      </w:rPr>
+    </w:lvl>
+  </w:abstractNum>
+  <w:abstractNum w:abstractNumId="4" w15:restartNumberingAfterBreak="0">
     <w:nsid w:val="49690C32"/>
     <w:multiLevelType w:val="multilevel"/>
     <w:tmpl w:val="157EC198"/>
+    <w:lvl w:ilvl="0">
+      <w:start w:val="1"/>
+      <w:numFmt w:val="bullet"/>
+      <w:lvlText w:val=""/>
+      <w:lvlJc w:val="left"/>
+      <w:pPr>
+        <w:tabs>
+          <w:tab w:val="num" w:pos="720"/>
+        </w:tabs>
+        <w:ind w:left="720" w:hanging="360"/>
+      </w:pPr>
+      <w:rPr>
+        <w:rFonts w:ascii="Symbol" w:hAnsi="Symbol" w:hint="default"/>
+        <w:sz w:val="20"/>
+      </w:rPr>
+    </w:lvl>
+    <w:lvl w:ilvl="1" w:tentative="1">
+      <w:start w:val="1"/>
+      <w:numFmt w:val="bullet"/>
+      <w:lvlText w:val="o"/>
+      <w:lvlJc w:val="left"/>
+      <w:pPr>
+        <w:tabs>
+          <w:tab w:val="num" w:pos="1440"/>
+        </w:tabs>
+        <w:ind w:left="1440" w:hanging="360"/>
+      </w:pPr>
+      <w:rPr>
+        <w:rFonts w:ascii="Courier New" w:hAnsi="Courier New" w:hint="default"/>
+        <w:sz w:val="20"/>
+      </w:rPr>
+    </w:lvl>
+    <w:lvl w:ilvl="2" w:tentative="1">
+      <w:start w:val="1"/>
+      <w:numFmt w:val="bullet"/>
+      <w:lvlText w:val=""/>
+      <w:lvlJc w:val="left"/>
+      <w:pPr>
+        <w:tabs>
+          <w:tab w:val="num" w:pos="2160"/>
+        </w:tabs>
+        <w:ind w:left="2160" w:hanging="360"/>
+      </w:pPr>
+      <w:rPr>
+        <w:rFonts w:ascii="Wingdings" w:hAnsi="Wingdings" w:hint="default"/>
+        <w:sz w:val="20"/>
+      </w:rPr>
+    </w:lvl>
+    <w:lvl w:ilvl="3" w:tentative="1">
+      <w:start w:val="1"/>
+      <w:numFmt w:val="bullet"/>
+      <w:lvlText w:val=""/>
+      <w:lvlJc w:val="left"/>
+      <w:pPr>
+        <w:tabs>
+          <w:tab w:val="num" w:pos="2880"/>
+        </w:tabs>
+        <w:ind w:left="2880" w:hanging="360"/>
+      </w:pPr>
+      <w:rPr>
+        <w:rFonts w:ascii="Wingdings" w:hAnsi="Wingdings" w:hint="default"/>
+        <w:sz w:val="20"/>
+      </w:rPr>
+    </w:lvl>
+    <w:lvl w:ilvl="4" w:tentative="1">
+      <w:start w:val="1"/>
+      <w:numFmt w:val="bullet"/>
+      <w:lvlText w:val=""/>
+      <w:lvlJc w:val="left"/>
+      <w:pPr>
+        <w:tabs>
+          <w:tab w:val="num" w:pos="3600"/>
+        </w:tabs>
+        <w:ind w:left="3600" w:hanging="360"/>
+      </w:pPr>
+      <w:rPr>
+        <w:rFonts w:ascii="Wingdings" w:hAnsi="Wingdings" w:hint="default"/>
+        <w:sz w:val="20"/>
+      </w:rPr>
+    </w:lvl>
+    <w:lvl w:ilvl="5" w:tentative="1">
+      <w:start w:val="1"/>
+      <w:numFmt w:val="bullet"/>
+      <w:lvlText w:val=""/>
+      <w:lvlJc w:val="left"/>
+      <w:pPr>
+        <w:tabs>
+          <w:tab w:val="num" w:pos="4320"/>
+        </w:tabs>
+        <w:ind w:left="4320" w:hanging="360"/>
+      </w:pPr>
+      <w:rPr>
+        <w:rFonts w:ascii="Wingdings" w:hAnsi="Wingdings" w:hint="default"/>
+        <w:sz w:val="20"/>
+      </w:rPr>
+    </w:lvl>
+    <w:lvl w:ilvl="6" w:tentative="1">
+      <w:start w:val="1"/>
+      <w:numFmt w:val="bullet"/>
+      <w:lvlText w:val=""/>
+      <w:lvlJc w:val="left"/>
+      <w:pPr>
+        <w:tabs>
+          <w:tab w:val="num" w:pos="5040"/>
+        </w:tabs>
+        <w:ind w:left="5040" w:hanging="360"/>
+      </w:pPr>
+      <w:rPr>
+        <w:rFonts w:ascii="Wingdings" w:hAnsi="Wingdings" w:hint="default"/>
+        <w:sz w:val="20"/>
+      </w:rPr>
+    </w:lvl>
+    <w:lvl w:ilvl="7" w:tentative="1">
+      <w:start w:val="1"/>
+      <w:numFmt w:val="bullet"/>
+      <w:lvlText w:val=""/>
+      <w:lvlJc w:val="left"/>
+      <w:pPr>
+        <w:tabs>
+          <w:tab w:val="num" w:pos="5760"/>
+        </w:tabs>
+        <w:ind w:left="5760" w:hanging="360"/>
+      </w:pPr>
+      <w:rPr>
+        <w:rFonts w:ascii="Wingdings" w:hAnsi="Wingdings" w:hint="default"/>
+        <w:sz w:val="20"/>
+      </w:rPr>
+    </w:lvl>
+    <w:lvl w:ilvl="8" w:tentative="1">
+      <w:start w:val="1"/>
+      <w:numFmt w:val="bullet"/>
+      <w:lvlText w:val=""/>
+      <w:lvlJc w:val="left"/>
+      <w:pPr>
+        <w:tabs>
+          <w:tab w:val="num" w:pos="6480"/>
+        </w:tabs>
+        <w:ind w:left="6480" w:hanging="360"/>
+      </w:pPr>
+      <w:rPr>
+        <w:rFonts w:ascii="Wingdings" w:hAnsi="Wingdings" w:hint="default"/>
+        <w:sz w:val="20"/>
+      </w:rPr>
+    </w:lvl>
+  </w:abstractNum>
+  <w:abstractNum w:abstractNumId="5" w15:restartNumberingAfterBreak="0">
+    <w:nsid w:val="5DFF387B"/>
+    <w:multiLevelType w:val="multilevel"/>
+    <w:tmpl w:val="102CD566"/>
     <w:lvl w:ilvl="0">
       <w:start w:val="1"/>
       <w:numFmt w:val="bullet"/>
@@ -4011,7 +5896,13 @@
     <w:abstractNumId w:val="1"/>
   </w:num>
   <w:num w:numId="4" w16cid:durableId="771322267">
+    <w:abstractNumId w:val="4"/>
+  </w:num>
+  <w:num w:numId="5" w16cid:durableId="1998805683">
     <w:abstractNumId w:val="3"/>
+  </w:num>
+  <w:num w:numId="6" w16cid:durableId="486820042">
+    <w:abstractNumId w:val="5"/>
   </w:num>
 </w:numbering>
 </file>

</xml_diff>